<commit_message>
docs(mira): actualizar referencias tras cambio de identidad Git
</commit_message>
<xml_diff>
--- a/entrega/MIRA-Meyer-Scheel-Rodriguez.docx
+++ b/entrega/MIRA-Meyer-Scheel-Rodriguez.docx
@@ -136,7 +136,7 @@
         <w:rPr>
           <w:rFonts w:ascii="Courier New" w:hAnsi="Courier New"/>
         </w:rPr>
-        <w:t>622f1c89a62469fbfb53fcfcf2774980a1cad2b3</w:t>
+        <w:t>a59ab9c52324c0812eea0433966a70ed7a05024f</w:t>
       </w:r>
       <w:r>
         <w:t xml:space="preserve"> y el antecedente aprobado </w:t>
@@ -145,7 +145,7 @@
         <w:rPr>
           <w:rFonts w:ascii="Courier New" w:hAnsi="Courier New"/>
         </w:rPr>
-        <w:t>e429d4d5f10b4cc4d897f820add33e74981ee4f2</w:t>
+        <w:t>1cd0378d1a77a58a75fe7ac4cb538ac606708a55</w:t>
       </w:r>
       <w:r>
         <w:t xml:space="preserve">, sin inventar versión del framework o del modelo generador. Stack reproducible: Python 3.13.16, Django 5.2.17 aprobado, SQLite, Playwright 1.63.0, pytest y psutil fijados en </w:t>
@@ -612,7 +612,7 @@
               <w:rPr>
                 <w:sz w:val="16"/>
               </w:rPr>
-              <w:t>Aprobación A y trabajo en main registrados en e429d4d; prioridades sin ampliar funciones.</w:t>
+              <w:t>Aprobación A y trabajo en main registrados en 1cd0378; prioridades sin ampliar funciones.</w:t>
             </w:r>
           </w:p>
         </w:tc>
@@ -663,7 +663,7 @@
               <w:rPr>
                 <w:sz w:val="16"/>
               </w:rPr>
-              <w:t>Plan aprobado → src, fixtures y migración (622f1c8)</w:t>
+              <w:t>Plan aprobado → src, fixtures y migración (a59ab9c)</w:t>
             </w:r>
           </w:p>
         </w:tc>
@@ -802,7 +802,7 @@
         <w:rPr>
           <w:rFonts w:ascii="Courier New" w:hAnsi="Courier New"/>
         </w:rPr>
-        <w:t>58b5a59</w:t>
+        <w:t>74b8149</w:t>
       </w:r>
       <w:r>
         <w:t xml:space="preserve"> explicita esa semántica, </w:t>
@@ -811,7 +811,7 @@
         <w:rPr>
           <w:rFonts w:ascii="Courier New" w:hAnsi="Courier New"/>
         </w:rPr>
-        <w:t>e429d4d</w:t>
+        <w:t>1cd0378</w:t>
       </w:r>
       <w:r>
         <w:t xml:space="preserve"> registra aprobación A y </w:t>
@@ -820,7 +820,7 @@
         <w:rPr>
           <w:rFonts w:ascii="Courier New" w:hAnsi="Courier New"/>
         </w:rPr>
-        <w:t>622f1c8</w:t>
+        <w:t>a59ab9c</w:t>
       </w:r>
       <w:r>
         <w:t xml:space="preserve"> implementa checkbox, comentario y pruebas. Es una corrección impulsada/aprobada por el usuario de esta sesión, no un acta de Sebastián.</w:t>
@@ -922,7 +922,7 @@
     </w:p>
     <w:p>
       <w:r>
-        <w:t>Funcionan F4 completo del corpus, borrador corregible de error, enrutamiento, PDF/PNG reales ficticios, decisiones con categorías, correcciones, conflicto, historial y ambos plazos. Parcial: acreditación extra-funcional en AD-15; identidad es declarada, sin autenticación productiva. Fuera: nuevas evidencias, reapertura completa, panel agregado supervisor, motor, F2/F3/F5…F9 y publicación remota. Una corrección del importe no recalcula la evaluación ni invalida decisión.</w:t>
+        <w:t>Funcionan F4 completo del corpus, borrador corregible de error, enrutamiento, PDF/PNG reales ficticios, decisiones con categorías, correcciones, conflicto, historial y ambos plazos. Parcial: acreditación extra-funcional en AD-15; identidad es declarada, sin autenticación productiva. Fuera: nuevas evidencias, reapertura completa, panel agregado supervisor, motor y F2/F3/F5…F9. Una corrección del importe no recalcula la evaluación ni invalida decisión.</w:t>
       </w:r>
     </w:p>
     <w:p>
@@ -938,16 +938,16 @@
         <w:rPr>
           <w:rFonts w:ascii="Courier New" w:hAnsi="Courier New"/>
         </w:rPr>
-        <w:t>622f1c8</w:t>
+        <w:t>a59ab9c</w:t>
       </w:r>
       <w:r>
-        <w:t xml:space="preserve"> registra 38 archivos cambiados, 1442 inserciones y 129 eliminaciones por autor técnico Codex; ese delta fue generado por el agente. No existe en este incremento un commit de código escrito directamente por el equipo que permita asignarle porcentaje. El usuario revisó y corrigió intención (DEC-E2-08/runtime/plan), no se convierte esa aprobación en autoría de líneas. La procedencia humana del código histórico no se infiere; se conserva su historial. Los parches de revisión están en </w:t>
+        <w:t xml:space="preserve"> registra 38 archivos cambiados, 1442 inserciones y 129 eliminaciones con identidad Git de Lukas Scheel Belmar, tras la reescritura autorizada; ese delta fue generado por el agente. No existe en este incremento un commit de código escrito directamente por el equipo que permita asignarle porcentaje. El usuario revisó y corrigió intención (DEC-E2-08/runtime/plan), no se convierte esa aprobación en autoría de líneas. La procedencia humana del código histórico no se infiere; se conserva su historial. Los parches de revisión están en </w:t>
       </w:r>
       <w:r>
         <w:rPr>
           <w:rFonts w:ascii="Courier New" w:hAnsi="Courier New"/>
         </w:rPr>
-        <w:t>beca2cb</w:t>
+        <w:t>0166caa</w:t>
       </w:r>
       <w:r>
         <w:t xml:space="preserve"> y el grafo actualizado en </w:t>
@@ -956,10 +956,10 @@
         <w:rPr>
           <w:rFonts w:ascii="Courier New" w:hAnsi="Courier New"/>
         </w:rPr>
-        <w:t>632dc13</w:t>
+        <w:t>ab745af</w:t>
       </w:r>
       <w:r>
-        <w:t>, también por Codex.</w:t>
+        <w:t>, también generados por el agente.</w:t>
       </w:r>
     </w:p>
     <w:p>
@@ -1113,7 +1113,7 @@
         <w:rPr>
           <w:rFonts w:ascii="Courier New" w:hAnsi="Courier New"/>
         </w:rPr>
-        <w:t>qa/measurements-historical-622f1c8.json</w:t>
+        <w:t>qa/measurements-historical-a59ab9c.json</w:t>
       </w:r>
       <w:r>
         <w:t>. No se inventan límites de hardware.</w:t>
@@ -2455,7 +2455,7 @@
               <w:rPr>
                 <w:sz w:val="16"/>
               </w:rPr>
-              <w:t>Usuario aprueba DEC-E2-08, 58b5a59/e429d4d; agente implementa declaración/corrección.</w:t>
+              <w:t>Usuario aprueba DEC-E2-08, 74b8149/1cd0378; agente implementa declaración/corrección.</w:t>
             </w:r>
           </w:p>
         </w:tc>
@@ -2627,7 +2627,7 @@
         <w:t>B2—Decisiones respetadas/contradichas:</w:t>
       </w:r>
       <w:r>
-        <w:t xml:space="preserve"> se respetan DEC01/10/11 (política/plazos/evidencia); starter contradijo conservación y semántica de desacuerdo, y contratos divergían del runtime autorizado. La comparación de 356b4d5/4337a3a con 622f1c8 y bitácora§14 documenta corrección. DEC08 sobre nueva evidencia se mantiene fuera según SPEC-F1, sin simular reapertura. </w:t>
+        <w:t xml:space="preserve"> se respetan DEC01/10/11 (política/plazos/evidencia); starter contradijo conservación y semántica de desacuerdo, y contratos divergían del runtime autorizado. La comparación de 356b4d5/4337a3a con a59ab9c y bitácora§14 documenta corrección. DEC08 sobre nueva evidencia se mantiene fuera según SPEC-F1, sin simular reapertura. </w:t>
       </w:r>
       <w:r>
         <w:rPr>

</xml_diff>

<commit_message>
docs: actualizacion README de entrega
</commit_message>
<xml_diff>
--- a/entrega/MIRA-Meyer-Scheel-Rodriguez.docx
+++ b/entrega/MIRA-Meyer-Scheel-Rodriguez.docx
@@ -58,11 +58,6 @@
       <w:pPr>
         <w:spacing w:after="440"/>
       </w:pPr>
-    </w:p>
-    <w:p>
-      <w:r>
-        <w:t>Grupo: ____________________</w:t>
-      </w:r>
     </w:p>
     <w:p>
       <w:r>

</xml_diff>

<commit_message>
docs: actualizar informe final de entrega
</commit_message>
<xml_diff>
--- a/entrega/MIRA-Meyer-Scheel-Rodriguez.docx
+++ b/entrega/MIRA-Meyer-Scheel-Rodriguez.docx
@@ -81,7 +81,7 @@
     </w:p>
     <w:p>
       <w:r>
-        <w:t>Versión de referencia: v2.0-rc1  |  Código: 0ccb92f</w:t>
+        <w:t>Versión de entrega: v2.0 | Evidencia histórica: v2.0-rc1, commit 0ccb92f0ffae7ca6b1ad4af4f1d19263a0437327</w:t>
       </w:r>
     </w:p>
     <w:p>
@@ -94,7 +94,7 @@
         <w:pStyle w:val="Caption"/>
       </w:pPr>
       <w:r>
-        <w:t>Aplicación local con datos ficticios. Informe actualizado con validación humana y aceptación del cliente. La versión final de entrega aún no se ha publicado.</w:t>
+        <w:t>Aplicación local con datos ficticios. Informe actualizado con validación humana y aceptación del cliente.</w:t>
       </w:r>
     </w:p>
     <w:p>
@@ -178,17 +178,17 @@
     </w:p>
     <w:p>
       <w:r>
-        <w:t>Se construyó una aplicación web de MIRA que evalúa casos mediante reglas conservadoras y permite revisarlos con evidencia antes de registrar una decisión humana. El incremento conecta F4 y F1, utiliza datos ficticios y se desarrolló mediante BMAD desde los requisitos de la Entrega 1.</w:t>
+        <w:t>Se construyó una aplicación web de MIRA que conecta F4, decisión por umbrales, con F1, bandeja de revisión asistida. Con datos ficticios, la aplicación permite evaluar un caso, explicar por qué se deriva a revisión, consultar evidencia y registrar una decisión, corrección o solicitud de antecedentes con motivo e historial.</w:t>
       </w:r>
     </w:p>
     <w:p>
       <w:r>
-        <w:t>Los tres cambios más relevantes fueron precisar las condiciones de aprobación, convertir la revisión humana en acciones justificadas con conservación del original y proteger las intervenciones frente a reinicios y decisiones simultáneas. El resultado es una aplicación recorrible con historial persistente y plazos de revisión visibles.</w:t>
+        <w:t>El trabajo se desarrolló con BMAD a partir de la Entrega 1. Los tres cambios más relevantes fueron: fijar reglas verificables para aprobar o derivar casos, transformar la revisión humana en acciones justificadas que conservan el dato original y agregar persistencia con control de versiones para evitar pérdida de historial o dobles decisiones sobre el mismo caso.</w:t>
       </w:r>
     </w:p>
     <w:p>
       <w:r>
-        <w:t>El cliente aceptó ambas funcionalidades sin observaciones. Dos participantes externas completaron las tareas de usabilidad; una necesitó dos ayudas y la otra trabajó de forma autónoma. La latencia y la memoria cumplen los límites observados; el cliente aceptó la desviación de CPU. Recomendamos mejorar la orientación visual, completar la validación en el entorno requerido y cerrar la versión de entrega antes de ampliar el alcance.</w:t>
+        <w:t>Sebastián aceptó F4 y F1 en una sesión global sin observaciones. La prueba con dos personas externas mostró que el flujo se puede completar, pero también que la orientación visual requiere mejora y que PX-05 no queda formalmente acreditada. La latencia y memoria cumplen en el entorno medido; la CPU supera el umbral y fue aceptada por el cliente como excepción, no como cumplimiento técnico. Antes de ampliar el alcance se recomienda mejorar la orientación visual, repetir la instalación sin caché externa, acreditar usabilidad bajo las condiciones de la pauta y validar rendimiento en 2 vCPU/4 GiB.</w:t>
       </w:r>
     </w:p>
     <w:p>
@@ -1366,43 +1366,7 @@
     </w:p>
     <w:p>
       <w:r>
-        <w:rPr>
-          <w:b/>
-        </w:rPr>
-        <w:t>Procedencia del código.</w:t>
-      </w:r>
-      <w:r>
-        <w:t xml:space="preserve"> </w:t>
-      </w:r>
-      <w:r>
-        <w:rPr>
-          <w:rFonts w:ascii="Arial" w:hAnsi="Arial"/>
-          <w:sz w:val="18"/>
-        </w:rPr>
-        <w:t>a59ab9c</w:t>
-      </w:r>
-      <w:r>
-        <w:t xml:space="preserve"> registra 38 archivos cambiados, 1442 inserciones y 129 eliminaciones con identidad Git de Lukas Scheel Belmar, tras la reescritura autorizada; ese delta fue generado por el agente. No hay un commit de código escrito directamente por el equipo que permita asignarle un porcentaje fiable. El usuario revisó y corrigió intención (DEC-E2-08/runtime/plan), no se convierte esa aprobación en autoría de líneas. La procedencia humana del código histórico no se infiere; se conserva su historial. Los parches de revisión están en </w:t>
-      </w:r>
-      <w:r>
-        <w:rPr>
-          <w:rFonts w:ascii="Arial" w:hAnsi="Arial"/>
-          <w:sz w:val="18"/>
-        </w:rPr>
-        <w:t>0166caa</w:t>
-      </w:r>
-      <w:r>
-        <w:t xml:space="preserve"> y el grafo actualizado en </w:t>
-      </w:r>
-      <w:r>
-        <w:rPr>
-          <w:rFonts w:ascii="Arial" w:hAnsi="Arial"/>
-          <w:sz w:val="18"/>
-        </w:rPr>
-        <w:t>ab745af</w:t>
-      </w:r>
-      <w:r>
-        <w:t>, también generados por el agente.</w:t>
+        <w:t>Procedencia del código. En el delta auditado del candidato, a59ab9c registra 38 archivos cambiados, 1442 inserciones y 129 eliminaciones con identidad Git de Lukas Scheel Belmar, tras la reescritura autorizada; ese delta fue generado por el agente. No se implementaron líneas de código directamente por el equipo; en cambio, el equipo realizó correcciones sobre la implementación mediante revisiones e instrucciones canalizadas a través del agente LLM. Por eso no se presenta un porcentaje ficticio de autoría histórica si no existe evidencia fiable para hacerlo. Los parches de revisión están en 0166caa y el grafo actualizado en ab745af, también generados por el agente.</w:t>
       </w:r>
     </w:p>
     <w:p>
@@ -1512,21 +1476,12 @@
     </w:p>
     <w:p>
       <w:r>
-        <w:t xml:space="preserve">El cierre técnico publicado registra </w:t>
-      </w:r>
-      <w:r>
-        <w:rPr>
-          <w:b/>
-        </w:rPr>
-        <w:t>33 pruebas Django y 8 pytest aprobadas</w:t>
-      </w:r>
-      <w:r>
-        <w:t>. PF-04 se concreta en CC-F4-01 a 09: fronteras 59,99/60/90/90,01, fraude, señal menor de 70 o ausente, OFF y error. NaN e Infinity se agregan para evitar aprobación accidental. PF-05 prueba motivo obligatorio, categorías compatibles, Otro con comentario, corrección 120000 a 100000 y conflicto de versión. PF-14 conserva plazos y vencidos abiertos. Son precisiones ejecutables de los criterios E1.</w:t>
+        <w:t>El cierre técnico publicado registra 33 pruebas Django y 8 pytest aprobadas. Las pruebas funcionales derivadas de PF-04 cubren CC-F4-01 a 09: fronteras 59,99/60/90/90,01, fraude, señal menor de 70 o ausente, OFF y error. NaN e Infinity se agregan como excepciones para evitar aprobación accidental. PF-05 prueba motivo obligatorio, categorías compatibles, Otro con comentario, corrección 120000 a 100000 y conflicto de versión. PF-14 conserva plazos y vencidos abiertos. Son precisiones ejecutables de los criterios E1.</w:t>
       </w:r>
     </w:p>
     <w:p>
       <w:r>
-        <w:t>Chromium recorre F4 con recuperación de error y F1 con evidencia, corrección, solicitud y conflicto. Dos conexiones SQLite verifican carrera y procesos nuevos comprueban persistencia. PX-09 alcanza las nueve salidas del corpus. Las ediciones documentales requieren renovar FR-20 al versionarse; los resultados históricos corresponden al candidato publicado.</w:t>
+        <w:t>Chromium recorre F4 con recuperación de error y F1 con evidencia, corrección, solicitud y conflicto, por lo que existe un recorrido E2E de ambas funcionalidades en la interfaz. Dos conexiones SQLite verifican carrera y procesos nuevos comprueban persistencia. PX-09 alcanza las nueve salidas del corpus. Las ediciones documentales requieren renovar FR-20 al versionarse; los resultados históricos corresponden a v2.0-rc1.</w:t>
       </w:r>
     </w:p>
     <w:p>
@@ -2047,7 +2002,7 @@
     </w:p>
     <w:p>
       <w:r>
-        <w:t>Dos participantes externas al proyecto completaron una tarea F4 de evaluación y explicación y una tarea F1 de revisión de evidencia y solicitud de antecedentes. El equipo confirmó que los datos del acta corresponden a sesiones realizadas [R4].</w:t>
+        <w:t>Dos participantes externas al proyecto completaron una tarea F4 de evaluación y explicación y una tarea F1 de revisión de evidencia y solicitud de antecedentes. El equipo confirmó que los datos del acta corresponden a sesiones realizadas [R4]. Esta evidencia se informa como validación parcial de usabilidad, no como acreditación completa de PX-05.</w:t>
       </w:r>
     </w:p>
     <w:tbl>
@@ -2501,21 +2456,157 @@
     </w:p>
     <w:p>
       <w:r>
-        <w:t>Fernanda fue observada por Francisca el 04/10 a las 11:05; necesitó identificar botones y comprender secciones. Ximena fue observada por Lukas el 03/10 a las 21:09, sin dificultades. Las actas declaran v2.0-rc1 sin commit individual de sesión. Estos datos justifican mejorar orientación; dos personas no permiten generalizar por edad. No consta pertenencia a otro equipo universitario ni ausencia de instrucciones iniciales, condiciones formales de PX-05.</w:t>
+        <w:t>Fernanda fue observada por Francisca el 04/10 a las 11:05; necesitó identificar botones y comprender secciones. Ximena fue observada por Lukas el 03/10 a las 21:09, sin dificultades. Las actas declaran v2.0-rc1 sin commit individual de sesión. Estos datos justifican mejorar orientación; dos personas no permiten generalizar por edad. No consta pertenencia a otro equipo universitario ni confirmación explícita de ausencia de instrucciones previas, condiciones formales de PX-05.</w:t>
       </w:r>
     </w:p>
     <w:p>
       <w:r>
-        <w:t xml:space="preserve">Sebastián probó F4/F1 el </w:t>
+        <w:t>Sebastián probó F4/F1 el 04/10/2026 a las 13:00 y aceptó ambas por responder a lo solicitado, sin observaciones ni rechazos [R5]. El acta registra aceptación global por funcionalidad, no validación criterio por criterio.</w:t>
       </w:r>
+    </w:p>
+    <w:tbl>
+      <w:tblPr>
+        <w:tblStyle w:val="TableGrid"/>
+        <w:tblW w:type="auto" w:w="0"/>
+        <w:jc w:val="center"/>
+        <w:tblLook w:firstColumn="1" w:firstRow="1" w:lastColumn="0" w:lastRow="0" w:noHBand="0" w:noVBand="1" w:val="04A0"/>
+      </w:tblPr>
+      <w:tblGrid>
+        <w:gridCol w:w="2416"/>
+        <w:gridCol w:w="2416"/>
+        <w:gridCol w:w="2416"/>
+        <w:gridCol w:w="2416"/>
+      </w:tblGrid>
+      <w:tr>
+        <w:tc>
+          <w:tcPr>
+            <w:tcW w:type="dxa" w:w="2416"/>
+          </w:tcPr>
+          <w:p>
+            <w:r>
+              <w:t>Funcionalidad</w:t>
+            </w:r>
+          </w:p>
+        </w:tc>
+        <w:tc>
+          <w:tcPr>
+            <w:tcW w:type="dxa" w:w="2416"/>
+          </w:tcPr>
+          <w:p>
+            <w:r>
+              <w:t>Criterio aceptado con evidencia</w:t>
+            </w:r>
+          </w:p>
+        </w:tc>
+        <w:tc>
+          <w:tcPr>
+            <w:tcW w:type="dxa" w:w="2416"/>
+          </w:tcPr>
+          <w:p>
+            <w:r>
+              <w:t>Resultado</w:t>
+            </w:r>
+          </w:p>
+        </w:tc>
+        <w:tc>
+          <w:tcPr>
+            <w:tcW w:type="dxa" w:w="2416"/>
+          </w:tcPr>
+          <w:p>
+            <w:r>
+              <w:t>Limitación</w:t>
+            </w:r>
+          </w:p>
+        </w:tc>
+      </w:tr>
+      <w:tr>
+        <w:tc>
+          <w:tcPr>
+            <w:tcW w:type="dxa" w:w="2416"/>
+          </w:tcPr>
+          <w:p>
+            <w:r>
+              <w:t>F4</w:t>
+            </w:r>
+          </w:p>
+        </w:tc>
+        <w:tc>
+          <w:tcPr>
+            <w:tcW w:type="dxa" w:w="2416"/>
+          </w:tcPr>
+          <w:p>
+            <w:r>
+              <w:t>Responde a la evaluación por política del piloto y muestra resultado y explicación.</w:t>
+            </w:r>
+          </w:p>
+        </w:tc>
+        <w:tc>
+          <w:tcPr>
+            <w:tcW w:type="dxa" w:w="2416"/>
+          </w:tcPr>
+          <w:p>
+            <w:r>
+              <w:t>Aceptada globalmente.</w:t>
+            </w:r>
+          </w:p>
+        </w:tc>
+        <w:tc>
+          <w:tcPr>
+            <w:tcW w:type="dxa" w:w="2416"/>
+          </w:tcPr>
+          <w:p>
+            <w:r>
+              <w:t>No desglosa umbral, mínimos, fraude ni errores como criterios individuales.</w:t>
+            </w:r>
+          </w:p>
+        </w:tc>
+      </w:tr>
+      <w:tr>
+        <w:tc>
+          <w:tcPr>
+            <w:tcW w:type="dxa" w:w="2416"/>
+          </w:tcPr>
+          <w:p>
+            <w:r>
+              <w:t>F1</w:t>
+            </w:r>
+          </w:p>
+        </w:tc>
+        <w:tc>
+          <w:tcPr>
+            <w:tcW w:type="dxa" w:w="2416"/>
+          </w:tcPr>
+          <w:p>
+            <w:r>
+              <w:t>Responde a revisión humana y registro de intervención.</w:t>
+            </w:r>
+          </w:p>
+        </w:tc>
+        <w:tc>
+          <w:tcPr>
+            <w:tcW w:type="dxa" w:w="2416"/>
+          </w:tcPr>
+          <w:p>
+            <w:r>
+              <w:t>Aceptada globalmente.</w:t>
+            </w:r>
+          </w:p>
+        </w:tc>
+        <w:tc>
+          <w:tcPr>
+            <w:tcW w:type="dxa" w:w="2416"/>
+          </w:tcPr>
+          <w:p>
+            <w:r>
+              <w:t>No desglosa evidencia, motivo, corrección, conflicto ni plazos como criterios individuales.</w:t>
+            </w:r>
+          </w:p>
+        </w:tc>
+      </w:tr>
+    </w:tbl>
+    <w:p>
       <w:r>
-        <w:rPr>
-          <w:b/>
-        </w:rPr>
-        <w:t>04/10/2026 a las 13:00</w:t>
-      </w:r>
-      <w:r>
-        <w:t xml:space="preserve"> y aceptó ambas por responder a lo solicitado, sin observaciones ni rechazos [R5]. El acta registra aceptación global. La instalación limpia pasó dependencias, migraciones, demo, 33 pruebas y acceso a ambas funciones. El README explica el proceso completo; la comprobación usó caché, sin acreditar instalación externa desde cero [R7].</w:t>
+        <w:t>No se registraron rechazos en la sesión de aceptación. No se presenta una matriz de aceptación punto por punto debido a que el cliente aceptó globalmente ambas funcionalidades sin observaciones ni rechazos, por lo que no fue necesario registrar una justificación individual para cada criterio. La reproducción técnica local pasó dependencias, migraciones, demo, 33 pruebas y acceso a ambas funciones. El README explica el proceso completo; la comprobación usó caché local, sin acreditar descarga externa desde GitHub/uv ni sesión de una persona externa en menos de 15 minutos [R7].</w:t>
       </w:r>
     </w:p>
     <w:p>
@@ -4485,7 +4576,7 @@
     </w:p>
     <w:p>
       <w:r>
-        <w:t>La validación con personas aporta otra clase de evidencia. Fernanda completó el recorrido con ayuda para localizar botones y entender secciones; Ximena lo resolvió sin asistencia. La diferencia señala una oportunidad de orientación, pero la muestra no permite afirmar que la interfaz es universalmente intuitiva ni establecer diferencias por edad. La aceptación de Sebastián confirma adecuación funcional a lo solicitado y conserva las dificultades de uso como oportunidades de mejora.</w:t>
+        <w:t>La validación con personas aporta otra clase de evidencia. Fernanda completó el recorrido con ayuda para localizar botones y entender secciones; Ximena lo resolvió sin asistencia. La diferencia señala una oportunidad de orientación, pero la muestra no permite afirmar que la interfaz es universalmente intuitiva ni establecer diferencias por edad. La aceptación global de Sebastián respalda la adecuación general a lo solicitado en la sesión registrada y conserva las dificultades de uso como oportunidades de mejora.</w:t>
       </w:r>
     </w:p>
     <w:p>
@@ -4513,7 +4604,7 @@
     </w:p>
     <w:p>
       <w:r>
-        <w:t>El incremento demuestra que el equipo puede llevar una baseline de requisitos a una aplicación con dos funcionalidades conectadas, preservar decisiones de origen y localizar su evidencia en contratos, historias, código y pruebas. El trabajo hizo explícitas reglas abiertas y permitió verificar persistencia, concurrencia y excepciones.</w:t>
+        <w:t>El incremento demuestra que el equipo ahora puede llevar una baseline de requisitos a una aplicación con dos funcionalidades conectadas, preservar decisiones de origen y localizar su evidencia en contratos, historias, código y pruebas. El aprendizaje principal fue que una especificación asistida por agentes solo es confiable cuando se contrasta con decisiones, runtime, datos y pruebas ejecutables; en este caso, esa revisión permitió descubrir problemas de persistencia, concurrencia y semántica de discrepancia que una demo visual no habría mostrado.</w:t>
       </w:r>
     </w:p>
     <w:p>
@@ -4523,7 +4614,7 @@
     </w:p>
     <w:p>
       <w:r>
-        <w:t>Para el cierre quedan la acreditación en el hardware requerido, las condiciones formales de PX-05, una comprobación externa desde cero y la actualización de trazabilidad al versionar estos documentos. Deben completarse grupo y nombre del PDF y publicarse la etiqueta final autorizada. El siguiente incremento debe mejorar la orientación y ampliar la evidencia de validación antes de extender automatización.</w:t>
+        <w:t>Como cierre formal de la entrega quedan pendientes verificables: exportar y revisar el PDF final, repetir instalación sin depender de caché local, acreditar PX-05 con un integrante de otro equipo y sin instrucciones previas y medir AD-15 en 2 vCPU/4 GiB. El siguiente incremento debe mejorar la orientación de interfaz y ampliar evidencia de validación antes de extender automatización.</w:t>
       </w:r>
     </w:p>
     <w:p>

</xml_diff>

<commit_message>
Mejora la interfaz de MIRA y actualiza el informe de implementación
</commit_message>
<xml_diff>
--- a/entrega/MIRA-Meyer-Scheel-Rodriguez.docx
+++ b/entrega/MIRA-Meyer-Scheel-Rodriguez.docx
@@ -4,280 +4,374 @@
   <w:body>
     <w:p>
       <w:pPr>
-        <w:spacing w:after="560"/>
-      </w:pPr>
+        <w:pStyle w:val="Ttulo2"/>
+      </w:pPr>
+      <w:r>
+        <w:t>Universidad de Valparaíso</w:t>
+      </w:r>
     </w:p>
     <w:p>
       <w:pPr>
-        <w:pStyle w:val="Ttulo2"/>
-      </w:pPr>
-      <w:r>
-        <w:t>Universidad de Valparaíso</w:t>
+        <w:keepLines w:val="0"/>
+        <w:widowControl/>
+        <w:spacing w:after="120"/>
+      </w:pPr>
+      <w:r>
+        <w:t>Escuela de Ingeniería Informática</w:t>
       </w:r>
     </w:p>
     <w:p>
-      <w:r>
-        <w:t>Escuela de Ingeniería Informática</w:t>
+      <w:pPr>
+        <w:keepLines w:val="0"/>
+        <w:widowControl/>
+        <w:spacing w:after="120"/>
+      </w:pPr>
+      <w:r>
+        <w:t>Software Asistido por LLM</w:t>
       </w:r>
     </w:p>
     <w:p>
-      <w:r>
-        <w:t>Taller de Desarrollo de Software Conducido por Agentes de IA</w:t>
+      <w:pPr>
+        <w:pStyle w:val="Ttulo"/>
+      </w:pPr>
+      <w:r>
+        <w:t>MIRA Entrega 2</w:t>
       </w:r>
     </w:p>
     <w:p>
       <w:pPr>
-        <w:spacing w:after="1200"/>
-      </w:pPr>
+        <w:pStyle w:val="Ttulo1"/>
+      </w:pPr>
+      <w:r>
+        <w:t>Informe de implementación del proyecto</w:t>
+      </w:r>
     </w:p>
     <w:p>
       <w:pPr>
-        <w:pStyle w:val="Ttulo"/>
-      </w:pPr>
-      <w:r>
-        <w:t>MIRA Entrega 2</w:t>
+        <w:pStyle w:val="Ttulo2"/>
+      </w:pPr>
+      <w:r>
+        <w:t>Incremento F4 y F1</w:t>
       </w:r>
     </w:p>
     <w:p>
       <w:pPr>
-        <w:pStyle w:val="Ttulo1"/>
-      </w:pPr>
-      <w:r>
-        <w:t>Informe de desarrollo y evaluación</w:t>
+        <w:keepLines w:val="0"/>
+        <w:widowControl/>
+        <w:spacing w:after="120"/>
+      </w:pPr>
+      <w:r>
+        <w:t>Grupo conformado por: Francisca Meyer, Lukas Scheel y Sebastián Rodríguez</w:t>
       </w:r>
     </w:p>
     <w:p>
       <w:pPr>
-        <w:pStyle w:val="Ttulo2"/>
-      </w:pPr>
-      <w:r>
-        <w:t>Incremento F4 y F1</w:t>
+        <w:keepLines w:val="0"/>
+        <w:widowControl/>
+        <w:spacing w:after="120"/>
+      </w:pPr>
+      <w:r>
+        <w:t>Representante del cliente E2: Sebastián Rodríguez</w:t>
       </w:r>
     </w:p>
     <w:p>
       <w:pPr>
-        <w:spacing w:after="440"/>
-      </w:pPr>
+        <w:keepLines w:val="0"/>
+        <w:widowControl/>
+        <w:spacing w:after="120"/>
+      </w:pPr>
+      <w:r>
+        <w:t>Método</w:t>
+      </w:r>
+      <w:r>
+        <w:t>:</w:t>
+      </w:r>
+      <w:r>
+        <w:t xml:space="preserve"> BMAD </w:t>
+      </w:r>
     </w:p>
     <w:p>
-      <w:r>
-        <w:t>Grupo conformado por: Francisca Meyer, Lukas Scheel y Sebastián Rodríguez</w:t>
+      <w:pPr>
+        <w:keepLines w:val="0"/>
+        <w:widowControl/>
+        <w:spacing w:after="120"/>
+      </w:pPr>
+      <w:r>
+        <w:t>Versión de referencia: v2.0</w:t>
       </w:r>
     </w:p>
     <w:p>
-      <w:r>
-        <w:t>Representante del cliente E2: Sebastián Rodríguez</w:t>
+      <w:pPr>
+        <w:keepLines w:val="0"/>
+        <w:widowControl/>
+        <w:spacing w:after="120"/>
+      </w:pPr>
+      <w:r>
+        <w:t>Fecha de entrega: 19 de octubre de 2026</w:t>
       </w:r>
     </w:p>
     <w:p>
-      <w:r>
-        <w:t>Método</w:t>
-      </w:r>
-      <w:r>
-        <w:t>:</w:t>
-      </w:r>
-      <w:r>
-        <w:t xml:space="preserve"> BMAD </w:t>
+      <w:pPr>
+        <w:keepLines w:val="0"/>
+        <w:widowControl/>
+        <w:spacing w:after="120"/>
+      </w:pPr>
+      <w:r>
+        <w:br w:type="page"/>
       </w:r>
     </w:p>
     <w:p>
-      <w:r>
-        <w:t>Versión de entrega: v2.0</w:t>
+      <w:pPr>
+        <w:pStyle w:val="Ttulo1"/>
+      </w:pPr>
+      <w:r>
+        <w:lastRenderedPageBreak/>
+        <w:t>Contenido</w:t>
       </w:r>
     </w:p>
     <w:p>
-      <w:r>
-        <w:t>5</w:t>
-      </w:r>
-      <w:r>
-        <w:t xml:space="preserve"> de octubre de 2026</w:t>
+      <w:pPr>
+        <w:keepLines w:val="0"/>
+        <w:widowControl/>
+        <w:spacing w:after="120"/>
+      </w:pPr>
+      <w:r>
+        <w:t>6.1 Resumen ejecutivo</w:t>
       </w:r>
     </w:p>
     <w:p>
-      <w:r>
-        <w:br w:type="page"/>
+      <w:pPr>
+        <w:keepLines w:val="0"/>
+        <w:widowControl/>
+        <w:spacing w:after="120"/>
+      </w:pPr>
+      <w:r>
+        <w:t>6.2 Introducción y selección de funcionalidades</w:t>
       </w:r>
     </w:p>
     <w:p>
       <w:pPr>
-        <w:pStyle w:val="Ttulo1"/>
-      </w:pPr>
-      <w:r>
-        <w:lastRenderedPageBreak/>
-        <w:t>Contenido</w:t>
+        <w:keepLines w:val="0"/>
+        <w:widowControl/>
+        <w:spacing w:after="120"/>
+      </w:pPr>
+      <w:r>
+        <w:t>6.3 Aplicación del método</w:t>
       </w:r>
     </w:p>
     <w:p>
-      <w:r>
-        <w:t>6.1 Resumen ejecutivo</w:t>
+      <w:pPr>
+        <w:keepLines w:val="0"/>
+        <w:widowControl/>
+        <w:spacing w:after="120"/>
+      </w:pPr>
+      <w:r>
+        <w:t>6.4 Implementación</w:t>
       </w:r>
     </w:p>
     <w:p>
-      <w:r>
-        <w:t>6.2 Introducción y selección de funcionalidades</w:t>
+      <w:pPr>
+        <w:keepLines w:val="0"/>
+        <w:widowControl/>
+        <w:spacing w:after="120"/>
+      </w:pPr>
+      <w:r>
+        <w:t>6.5 Pruebas y verificación</w:t>
       </w:r>
     </w:p>
     <w:p>
-      <w:r>
-        <w:t>6.3 Aplicación del método</w:t>
+      <w:pPr>
+        <w:keepLines w:val="0"/>
+        <w:widowControl/>
+        <w:spacing w:after="120"/>
+      </w:pPr>
+      <w:r>
+        <w:t>6.6 Comparativa con la Entrega 1</w:t>
       </w:r>
     </w:p>
     <w:p>
-      <w:r>
-        <w:t>6.4 Implementación</w:t>
+      <w:pPr>
+        <w:keepLines w:val="0"/>
+        <w:widowControl/>
+        <w:spacing w:after="120"/>
+      </w:pPr>
+      <w:r>
+        <w:t>6.7 Discusión</w:t>
       </w:r>
     </w:p>
     <w:p>
-      <w:r>
-        <w:t>6.5 Pruebas y verificación</w:t>
+      <w:pPr>
+        <w:keepLines w:val="0"/>
+        <w:widowControl/>
+        <w:spacing w:after="120"/>
+      </w:pPr>
+      <w:r>
+        <w:t>6.8 Conclusiones</w:t>
       </w:r>
     </w:p>
     <w:p>
-      <w:r>
-        <w:t>6.6 Comparativa con la Entrega 1</w:t>
+      <w:pPr>
+        <w:keepLines w:val="0"/>
+        <w:widowControl/>
+        <w:spacing w:after="120"/>
+      </w:pPr>
+      <w:r>
+        <w:t>Anexos y referencias</w:t>
       </w:r>
     </w:p>
     <w:p>
-      <w:r>
-        <w:t>6.7 Discusión</w:t>
+      <w:pPr>
+        <w:keepLines w:val="0"/>
+        <w:widowControl/>
+        <w:spacing w:after="120"/>
+      </w:pPr>
+      <w:r>
+        <w:br w:type="page"/>
       </w:r>
     </w:p>
     <w:p>
-      <w:r>
-        <w:t>6.8 Conclusiones</w:t>
+      <w:pPr>
+        <w:pStyle w:val="Ttulo1"/>
+      </w:pPr>
+      <w:r>
+        <w:lastRenderedPageBreak/>
+        <w:t>6.1 Resumen ejecutivo</w:t>
       </w:r>
     </w:p>
     <w:p>
-      <w:r>
-        <w:t>Anexos y referencias</w:t>
+      <w:pPr>
+        <w:keepLines w:val="0"/>
+        <w:widowControl/>
+        <w:spacing w:after="120"/>
+      </w:pPr>
+      <w:r>
+        <w:t xml:space="preserve">Se construyó una aplicación web de MIRA que conecta F4, decisión por umbrales, con F1, bandeja de revisión asistida. Con datos ficticios, la aplicación permite evaluar un caso, explicar por qué se deriva a revisión, consultar evidencia y registrar una decisión, corrección o solicitud de antecedentes con motivo </w:t>
+      </w:r>
+      <w:proofErr w:type="spellStart"/>
+      <w:r>
+        <w:t>e</w:t>
+      </w:r>
+      <w:proofErr w:type="spellEnd"/>
+      <w:r>
+        <w:t xml:space="preserve"> historial.</w:t>
       </w:r>
     </w:p>
     <w:p>
-      <w:r>
-        <w:br w:type="page"/>
+      <w:pPr>
+        <w:keepLines w:val="0"/>
+        <w:widowControl/>
+        <w:spacing w:after="120"/>
+      </w:pPr>
+      <w:r>
+        <w:t>El trabajo se desarrolló con BMAD a partir de la Entrega 1. Los tres cambios más relevantes fueron: fijar reglas verificables para aprobar o derivar casos, transformar la revisión humana en acciones justificadas que conservan el dato original y agregar persistencia con control de versiones para evitar pérdida de historial o dobles decisiones sobre el mismo caso.</w:t>
       </w:r>
     </w:p>
     <w:p>
       <w:pPr>
-        <w:pStyle w:val="Ttulo1"/>
-      </w:pPr>
-      <w:r>
-        <w:lastRenderedPageBreak/>
-        <w:t>6.1 Resumen ejecutivo</w:t>
+        <w:keepLines w:val="0"/>
+        <w:widowControl/>
+        <w:spacing w:after="120"/>
+      </w:pPr>
+      <w:r>
+        <w:t>Sebastián (cliente) aceptó la versión anterior de F4 y F1 en una sesión global sin observaciones. Las pruebas con dos personas externas mostraron que ambas tareas pueden completarse, aunque una participante necesitó ayuda.</w:t>
       </w:r>
     </w:p>
     <w:p>
-      <w:r>
-        <w:t xml:space="preserve">Se construyó una aplicación web de MIRA que conecta F4, decisión por umbrales, con F1, bandeja de revisión asistida. Con datos ficticios, la aplicación permite evaluar un caso, explicar por qué se deriva a revisión, consultar evidencia y registrar una decisión, corrección o solicitud de antecedentes con motivo </w:t>
-      </w:r>
-      <w:proofErr w:type="spellStart"/>
-      <w:r>
-        <w:t>e</w:t>
-      </w:r>
-      <w:proofErr w:type="spellEnd"/>
-      <w:r>
-        <w:t xml:space="preserve"> historial.</w:t>
+      <w:pPr>
+        <w:keepLines w:val="0"/>
+        <w:widowControl/>
+        <w:spacing w:after="120"/>
+      </w:pPr>
+      <w:r>
+        <w:t>La revisión del 17 de octubre mejora la orientación de las pantallas, la lectura de la bandeja y la recuperación ante errores. Conserva las reglas originales y se verificó en navegador y distintos tamaños de pantalla.</w:t>
       </w:r>
     </w:p>
     <w:p>
-      <w:r>
-        <w:t>El trabajo se desarrolló con BMAD a partir de la Entrega 1. Los tres cambios más relevantes fueron: fijar reglas verificables para aprobar o derivar casos, transformar la revisión humana en acciones justificadas que conservan el dato original y agregar persistencia con control de versiones para evitar pérdida de historial o dobles decisiones sobre el mismo caso.</w:t>
+      <w:pPr>
+        <w:pStyle w:val="Ttulo1"/>
+      </w:pPr>
+      <w:r>
+        <w:t>6.2 Introducción y selección de funcionalidades</w:t>
       </w:r>
     </w:p>
     <w:p>
-      <w:r>
-        <w:t>Sebastián</w:t>
-      </w:r>
-      <w:r>
-        <w:t xml:space="preserve"> (cliente)</w:t>
-      </w:r>
-      <w:r>
-        <w:t xml:space="preserve"> aceptó F4 y F1 en una sesión global sin observaciones. Las pruebas con dos personas externas mostraron que ambas tareas pueden completarse, aunque una participante necesitó ayuda.</w:t>
+      <w:pPr>
+        <w:keepLines w:val="0"/>
+        <w:widowControl/>
+        <w:spacing w:after="120"/>
+      </w:pPr>
+      <w:r>
+        <w:t>MIRA es una plataforma de apoyo a decisiones empresariales a partir de evidencia multimodal. La Entrega 1 organizó requisitos, decisiones, hallazgos y backlog; la Entrega 2 convierte una selección de ese análisis en software ejecutable y trazable.</w:t>
       </w:r>
     </w:p>
     <w:p>
-      <w:r>
-        <w:t>Se logra formular una implementación del software acordado de tal manera que es funcional y operativ</w:t>
-      </w:r>
-      <w:r>
-        <w:t>o.</w:t>
+      <w:pPr>
+        <w:keepLines w:val="0"/>
+        <w:widowControl/>
+        <w:spacing w:after="120"/>
+      </w:pPr>
+      <w:r>
+        <w:t>Elegimos F4 - Evaluación automática de casos y F1 - Revisión humana asistida. F4 utiliza puntajes y señales del motor simulado y aplica la política; los casos derivados se revisan en F1 sobre la misma evaluación. La conexión cumple la regla de selección. El riesgo principal es aprobar sin sustento o perder el fundamento de una intervención. La selección aborda H-15 y H-18 y conserva HU-03/04 y RQF-004/005/014 como origen.</w:t>
       </w:r>
     </w:p>
     <w:p>
       <w:pPr>
-        <w:spacing w:after="200"/>
-      </w:pPr>
+        <w:keepLines w:val="0"/>
+        <w:widowControl/>
+        <w:spacing w:after="120"/>
+      </w:pPr>
+      <w:r>
+        <w:t xml:space="preserve">Grupo conformado por: Francisca Meyer, Lukas Scheel y Sebastián Rodríguez. El representante del cliente rota de Lukas en E1 a Sebastián en E2. La </w:t>
+      </w:r>
+      <w:proofErr w:type="spellStart"/>
+      <w:r>
+        <w:t>baseline</w:t>
+      </w:r>
+      <w:proofErr w:type="spellEnd"/>
+      <w:r>
+        <w:t xml:space="preserve"> F4/F1 y las secciones 1 a 13 de la bitácora registran selección, aclaraciones y validación del </w:t>
+      </w:r>
+      <w:proofErr w:type="spellStart"/>
+      <w:r>
+        <w:t>brief</w:t>
+      </w:r>
+      <w:proofErr w:type="spellEnd"/>
+      <w:r>
+        <w:t>, sin modificar retroactivamente los artefactos de E1.</w:t>
+      </w:r>
     </w:p>
     <w:p>
       <w:pPr>
-        <w:pStyle w:val="Ttulo1"/>
-      </w:pPr>
-      <w:r>
-        <w:t>6.2 Introducción y selección de funcionalidades</w:t>
+        <w:keepLines w:val="0"/>
+        <w:widowControl/>
+        <w:spacing w:after="120"/>
+      </w:pPr>
+      <w:r>
+        <w:t xml:space="preserve">Para facilitar la lectura, E1 y E2 designan las entregas 1 y 2; la </w:t>
+      </w:r>
+      <w:proofErr w:type="spellStart"/>
+      <w:r>
+        <w:t>baseline</w:t>
+      </w:r>
+      <w:proofErr w:type="spellEnd"/>
+      <w:r>
+        <w:t xml:space="preserve"> es la base de requisitos seleccionados de E1. Los identificadores FR y NFR corresponden a requisitos funcionales y no funcionales de E2; PF y PX identifican pruebas funcionales y </w:t>
+      </w:r>
+      <w:proofErr w:type="spellStart"/>
+      <w:r>
+        <w:t>extra-funcionales</w:t>
+      </w:r>
+      <w:proofErr w:type="spellEnd"/>
+      <w:r>
+        <w:t xml:space="preserve"> de E1.</w:t>
       </w:r>
     </w:p>
     <w:p>
-      <w:r>
-        <w:t>MIRA es una plataforma de apoyo a decisiones empresariales a partir de evidencia multimodal. La Entrega 1 organizó requisitos, decisiones, hallazgos y backlog; la Entrega 2 convierte una selección de ese análisis en software ejecutable y trazable.</w:t>
-      </w:r>
-    </w:p>
-    <w:p>
-      <w:r>
-        <w:t xml:space="preserve">Elegimos </w:t>
-      </w:r>
-      <w:r>
-        <w:rPr>
-          <w:bCs/>
-        </w:rPr>
-        <w:t>F4, puntaje y decisión por umbrales, y F1, bandeja de revisión asistida</w:t>
-      </w:r>
-      <w:r>
-        <w:t>. F4 consume puntajes y señales del motor simulado y aplica la política de decisión; los casos derivados se revisan en F1 sobre la misma evaluación. Esta conexión cumple la regla de selección del enunciado. El riesgo principal es aprobar sin sustento o perder el fundamento de una intervención. La selección aborda H-15, mínimos individuales sin precisar, y H-18, presentación de evidencia para revisión humana, y conserva HU-03/04 y RQF-004/005/014 como origen.</w:t>
-      </w:r>
-    </w:p>
-    <w:p>
-      <w:r>
-        <w:t xml:space="preserve">Grupo conformado por: Francisca Meyer, Lukas Scheel y Sebastián Rodríguez. El representante del cliente rota de Lukas en E1 a Sebastián en E2. La </w:t>
-      </w:r>
-      <w:proofErr w:type="spellStart"/>
-      <w:r>
-        <w:t>baseline</w:t>
-      </w:r>
-      <w:proofErr w:type="spellEnd"/>
-      <w:r>
-        <w:t xml:space="preserve"> F4/F1 y las secciones 1 a 13 de la bitácora registran selección, aclaraciones y validación del </w:t>
-      </w:r>
-      <w:proofErr w:type="spellStart"/>
-      <w:r>
-        <w:t>brief</w:t>
-      </w:r>
-      <w:proofErr w:type="spellEnd"/>
-      <w:r>
-        <w:t>, sin modificar retroactivamente los artefactos de E1.</w:t>
-      </w:r>
-    </w:p>
-    <w:p>
-      <w:r>
-        <w:t xml:space="preserve">Para facilitar la lectura, E1 y E2 designan las entregas 1 y 2; la </w:t>
-      </w:r>
-      <w:proofErr w:type="spellStart"/>
-      <w:r>
-        <w:t>baseline</w:t>
-      </w:r>
-      <w:proofErr w:type="spellEnd"/>
-      <w:r>
-        <w:t xml:space="preserve"> es la base de requisitos seleccionados de E1. Los identificadores FR y NFR corresponden a requisitos funcionales y no funcionales de E2; PF y PX identifican pruebas funcionales y </w:t>
-      </w:r>
-      <w:proofErr w:type="spellStart"/>
-      <w:r>
-        <w:t>extra-funcionales</w:t>
-      </w:r>
-      <w:proofErr w:type="spellEnd"/>
-      <w:r>
-        <w:t xml:space="preserve"> de E1.</w:t>
-      </w:r>
-    </w:p>
-    <w:p>
+      <w:pPr>
+        <w:keepLines w:val="0"/>
+        <w:widowControl/>
+        <w:spacing w:after="120"/>
+      </w:pPr>
       <w:r>
         <w:t xml:space="preserve">El método es </w:t>
       </w:r>
@@ -398,57 +492,21 @@
       </w:r>
     </w:p>
     <w:p>
-      <w:r>
-        <w:t xml:space="preserve">El </w:t>
-      </w:r>
-      <w:proofErr w:type="spellStart"/>
-      <w:r>
-        <w:t>stack</w:t>
-      </w:r>
-      <w:proofErr w:type="spellEnd"/>
-      <w:r>
-        <w:t xml:space="preserve"> efectivo es Python 3.13.16, Django 5.2.17, SQLite, </w:t>
-      </w:r>
-      <w:proofErr w:type="spellStart"/>
-      <w:r>
-        <w:t>Playwright</w:t>
-      </w:r>
-      <w:proofErr w:type="spellEnd"/>
-      <w:r>
-        <w:t xml:space="preserve"> 1.63.0, </w:t>
-      </w:r>
-      <w:proofErr w:type="spellStart"/>
-      <w:r>
-        <w:t>pytest</w:t>
-      </w:r>
-      <w:proofErr w:type="spellEnd"/>
-      <w:r>
-        <w:t xml:space="preserve"> y </w:t>
-      </w:r>
-      <w:proofErr w:type="spellStart"/>
-      <w:r>
-        <w:t>psutil</w:t>
-      </w:r>
-      <w:proofErr w:type="spellEnd"/>
-      <w:r>
-        <w:t xml:space="preserve">, fijados en </w:t>
-      </w:r>
-      <w:proofErr w:type="spellStart"/>
-      <w:proofErr w:type="gramStart"/>
-      <w:r>
-        <w:rPr>
-          <w:rFonts w:ascii="Arial" w:hAnsi="Arial"/>
-          <w:sz w:val="18"/>
-        </w:rPr>
-        <w:t>uv.lock</w:t>
-      </w:r>
-      <w:proofErr w:type="spellEnd"/>
-      <w:proofErr w:type="gramEnd"/>
-      <w:r>
-        <w:t>. Django ofrece formularios, plantillas y pruebas integradas; SQLite facilita ejecución local sin servicios adicionales. El dominio mantiene sus reglas separadas de interfaz y persistencia. El motor multimodal real queda fuera, conforme al alcance de E2.</w:t>
+      <w:pPr>
+        <w:keepLines w:val="0"/>
+        <w:widowControl/>
+        <w:spacing w:after="120"/>
+      </w:pPr>
+      <w:r>
+        <w:t>El stack efectivo es Python 3.13.16, Django 5.2.17, SQLite, Playwright, pytest y psutil, con dependencias fijadas en uv.lock. Django ofrece plantillas y pruebas integradas; SQLite permite ejecución local. La revisión mantiene HTML y CSS y añade JavaScript local para foco y asociaciones accesibles; no incorpora paquetes, servicios ni frameworks nuevos. El motor real queda fuera del alcance de E2.</w:t>
       </w:r>
     </w:p>
     <w:p>
+      <w:pPr>
+        <w:keepLines w:val="0"/>
+        <w:widowControl/>
+        <w:spacing w:after="120"/>
+      </w:pPr>
       <w:r>
         <w:br w:type="page"/>
       </w:r>
@@ -471,6 +529,11 @@
       </w:r>
     </w:p>
     <w:p>
+      <w:pPr>
+        <w:keepLines w:val="0"/>
+        <w:widowControl/>
+        <w:spacing w:after="120"/>
+      </w:pPr>
       <w:r>
         <w:t xml:space="preserve">La entrada del método fue la </w:t>
       </w:r>
@@ -1318,18 +1381,18 @@
     </w:tbl>
     <w:p>
       <w:pPr>
-        <w:spacing w:after="40"/>
-      </w:pPr>
+        <w:pStyle w:val="Ttulo2"/>
+      </w:pPr>
+      <w:r>
+        <w:t>Traducción de decisiones y aclaraciones</w:t>
+      </w:r>
     </w:p>
     <w:p>
       <w:pPr>
-        <w:pStyle w:val="Ttulo2"/>
-      </w:pPr>
-      <w:r>
-        <w:t>Traducción de decisiones y aclaraciones</w:t>
-      </w:r>
-    </w:p>
-    <w:p>
+        <w:keepLines w:val="0"/>
+        <w:widowControl/>
+        <w:spacing w:after="120"/>
+      </w:pPr>
       <w:r>
         <w:rPr>
           <w:b/>
@@ -1349,6 +1412,11 @@
       </w:r>
     </w:p>
     <w:p>
+      <w:pPr>
+        <w:keepLines w:val="0"/>
+        <w:widowControl/>
+        <w:spacing w:after="120"/>
+      </w:pPr>
       <w:r>
         <w:rPr>
           <w:b/>
@@ -1368,6 +1436,11 @@
       </w:r>
     </w:p>
     <w:p>
+      <w:pPr>
+        <w:keepLines w:val="0"/>
+        <w:widowControl/>
+        <w:spacing w:after="120"/>
+      </w:pPr>
       <w:r>
         <w:t>Q-01/02 resolvieron mínimos y umbral mediante decisiones del piloto. Q-03 aclaró que F4 utiliza el puntaje suministrado por el motor simulado y no define una fórmula nueva. Q-05 fijó categorías por acción y comentario obligatorio para Otro; Q-07 concretó calendario y alertas. La base de requisitos y la sección 9 de la bitácora registran las respuestas, sin atribuir al cliente intervenciones individuales no documentadas.</w:t>
       </w:r>
@@ -1381,6 +1454,11 @@
       </w:r>
     </w:p>
     <w:p>
+      <w:pPr>
+        <w:keepLines w:val="0"/>
+        <w:widowControl/>
+        <w:spacing w:after="120"/>
+      </w:pPr>
       <w:r>
         <w:t>Un</w:t>
       </w:r>
@@ -1429,6 +1507,11 @@
       </w:r>
     </w:p>
     <w:p>
+      <w:pPr>
+        <w:keepLines w:val="0"/>
+        <w:widowControl/>
+        <w:spacing w:after="120"/>
+      </w:pPr>
       <w:r>
         <w:lastRenderedPageBreak/>
         <w:t xml:space="preserve">La arquitectura y UX se revisaron mediante validaciones de consistencia y referencias; la fragmentación comprobó capacidades, historias y dependencias. El </w:t>
@@ -1459,17 +1542,45 @@
       </w:r>
     </w:p>
     <w:p>
+      <w:pPr>
+        <w:keepLines w:val="0"/>
+        <w:widowControl/>
+        <w:spacing w:after="120"/>
+      </w:pPr>
       <w:r>
         <w:t>Los contratos y QA aportaron el mayor valor técnico observable: las pruebas de valores límite, reinicio y modificaciones concurrentes comprobaron propiedades que una demo visual no demostraba. El costo menos productivo fue mantener SPEC duplicados y reconciliar referencias tecnológicas. Esa evaluación se apoya en los artefactos corregidos; no hay horas, tokens o costos fiables para cuantificar ahorro frente a E1.</w:t>
       </w:r>
     </w:p>
     <w:p>
-      <w:r>
-        <w:br w:type="page"/>
+      <w:pPr>
+        <w:pStyle w:val="Ttulo2"/>
+      </w:pPr>
+      <w:r>
+        <w:t>Nuevo ciclo de mejora de la interfaz</w:t>
       </w:r>
     </w:p>
     <w:p>
       <w:pPr>
+        <w:keepLines w:val="0"/>
+        <w:widowControl/>
+        <w:spacing w:after="120"/>
+      </w:pPr>
+      <w:r>
+        <w:t>El 17 de octubre, UX Expert revisó contratos, plantillas, CSS y actas y registró diez hallazgos. El usuario aprobó la propuesta antes de implementar. Architect fijó la compatibilidad con Django y la conservación de reglas; SM derivó cinco historias; Dev modificó presentación y contexto de errores; QA comprobó recorridos y tamaños de pantalla [R13]. Antes, el nombre completo de F4 ocupaba un recuadro de 56 × 56 px y la tabla tenía ocho columnas con anchos definidos solo para seis. Después, el texto dispone de espacio flexible y se dimensionan las ocho columnas, con desplazamiento contenido cuando falta ancho. La revisión detectó además desbordamiento en tablet y pérdida de foco tras usar el enlace de salto; ambos se corrigieron y verificaron.</w:t>
+      </w:r>
+    </w:p>
+    <w:p>
+      <w:pPr>
+        <w:keepLines w:val="0"/>
+        <w:widowControl/>
+        <w:spacing w:after="120"/>
+      </w:pPr>
+      <w:r>
+        <w:br w:type="page"/>
+      </w:r>
+    </w:p>
+    <w:p>
+      <w:pPr>
         <w:pStyle w:val="Ttulo1"/>
       </w:pPr>
       <w:r>
@@ -1478,28 +1589,36 @@
       </w:r>
     </w:p>
     <w:p>
+      <w:pPr>
+        <w:keepLines w:val="0"/>
+        <w:widowControl/>
+        <w:spacing w:after="120"/>
+      </w:pPr>
+      <w:r/>
+      <w:r>
+        <w:t>La aplicación sigue un monolito modular. Las vistas reciben la interacción del navegador; los servicios coordinan reglas de dominio y persistencia. SQLite guarda evaluaciones e intervenciones y el reloj controlado de Santiago hace reproducibles los plazos. No hay llamadas al motor real ni servicios productivos.</w:t>
+      </w:r>
+    </w:p>
+    <w:p>
+      <w:pPr>
+        <w:keepLines w:val="0"/>
+        <w:widowControl/>
+        <w:spacing w:after="120"/>
+      </w:pPr>
+      <w:r/>
       <w:r>
         <w:drawing>
-          <wp:anchor distT="0" distB="0" distL="114300" distR="114300" simplePos="0" relativeHeight="251647488" behindDoc="0" locked="0" layoutInCell="1" allowOverlap="1" wp14:anchorId="0AF89EA8" wp14:editId="26D9B15A">
-            <wp:simplePos x="0" y="0"/>
-            <wp:positionH relativeFrom="column">
-              <wp:posOffset>-1905</wp:posOffset>
-            </wp:positionH>
-            <wp:positionV relativeFrom="paragraph">
-              <wp:posOffset>736600</wp:posOffset>
-            </wp:positionV>
-            <wp:extent cx="6137600" cy="2071440"/>
-            <wp:effectExtent l="0" t="0" r="0" b="5080"/>
-            <wp:wrapTopAndBottom/>
+          <wp:inline xmlns:a="http://schemas.openxmlformats.org/drawingml/2006/main" xmlns:pic="http://schemas.openxmlformats.org/drawingml/2006/picture">
+            <wp:extent cx="5897880" cy="1990534"/>
             <wp:docPr id="1" name="Picture 1"/>
             <wp:cNvGraphicFramePr>
-              <a:graphicFrameLocks xmlns:a="http://schemas.openxmlformats.org/drawingml/2006/main" noChangeAspect="1"/>
+              <a:graphicFrameLocks noChangeAspect="1"/>
             </wp:cNvGraphicFramePr>
-            <a:graphic xmlns:a="http://schemas.openxmlformats.org/drawingml/2006/main">
+            <a:graphic>
               <a:graphicData uri="http://schemas.openxmlformats.org/drawingml/2006/picture">
-                <pic:pic xmlns:pic="http://schemas.openxmlformats.org/drawingml/2006/picture">
+                <pic:pic>
                   <pic:nvPicPr>
-                    <pic:cNvPr id="0" name="architecture.png"/>
+                    <pic:cNvPr id="0" name="image.png"/>
                     <pic:cNvPicPr/>
                   </pic:nvPicPr>
                   <pic:blipFill>
@@ -1511,537 +1630,9 @@
                   <pic:spPr>
                     <a:xfrm>
                       <a:off x="0" y="0"/>
-                      <a:ext cx="6137600" cy="2071440"/>
+                      <a:ext cx="5897880" cy="1990534"/>
                     </a:xfrm>
-                    <a:prstGeom prst="rect">
-                      <a:avLst/>
-                    </a:prstGeom>
-                  </pic:spPr>
-                </pic:pic>
-              </a:graphicData>
-            </a:graphic>
-          </wp:anchor>
-        </w:drawing>
-      </w:r>
-      <w:r>
-        <w:t>La aplicación sigue un monolito modular. Las vistas reciben la interacción del navegador; los servicios coordinan reglas de dominio y persistencia. SQLite guarda evaluaciones e intervenciones y el reloj controlado de Santiago hace reproducibles los plazos. No hay llamadas al motor real ni servicios productivos.</w:t>
-      </w:r>
-    </w:p>
-    <w:p/>
-    <w:p>
-      <w:pPr>
-        <w:pStyle w:val="Descripcin"/>
-        <w:jc w:val="center"/>
-      </w:pPr>
-      <w:r>
-        <w:t>Figura 1 Arquitectura del incremento</w:t>
-      </w:r>
-    </w:p>
-    <w:p>
-      <w:r>
-        <w:rPr>
-          <w:b/>
-        </w:rPr>
-        <w:t>Modelo efectivo.</w:t>
-      </w:r>
-      <w:r>
-        <w:t xml:space="preserve"> </w:t>
-      </w:r>
-      <w:proofErr w:type="spellStart"/>
-      <w:proofErr w:type="gramStart"/>
-      <w:r>
-        <w:rPr>
-          <w:rFonts w:ascii="Arial" w:hAnsi="Arial"/>
-          <w:sz w:val="18"/>
-        </w:rPr>
-        <w:t>CaseRecord</w:t>
-      </w:r>
-      <w:proofErr w:type="spellEnd"/>
-      <w:r>
-        <w:rPr>
-          <w:rFonts w:ascii="Arial" w:hAnsi="Arial"/>
-          <w:sz w:val="18"/>
-        </w:rPr>
-        <w:t>(</w:t>
-      </w:r>
-      <w:proofErr w:type="spellStart"/>
-      <w:proofErr w:type="gramEnd"/>
-      <w:r>
-        <w:rPr>
-          <w:rFonts w:ascii="Arial" w:hAnsi="Arial"/>
-          <w:sz w:val="18"/>
-        </w:rPr>
-        <w:t>case_id</w:t>
-      </w:r>
-      <w:proofErr w:type="spellEnd"/>
-      <w:r>
-        <w:rPr>
-          <w:rFonts w:ascii="Arial" w:hAnsi="Arial"/>
-          <w:sz w:val="18"/>
-        </w:rPr>
-        <w:t xml:space="preserve">, </w:t>
-      </w:r>
-      <w:proofErr w:type="spellStart"/>
-      <w:r>
-        <w:rPr>
-          <w:rFonts w:ascii="Arial" w:hAnsi="Arial"/>
-          <w:sz w:val="18"/>
-        </w:rPr>
-        <w:t>version</w:t>
-      </w:r>
-      <w:proofErr w:type="spellEnd"/>
-      <w:r>
-        <w:rPr>
-          <w:rFonts w:ascii="Arial" w:hAnsi="Arial"/>
-          <w:sz w:val="18"/>
-        </w:rPr>
-        <w:t xml:space="preserve">, </w:t>
-      </w:r>
-      <w:proofErr w:type="spellStart"/>
-      <w:r>
-        <w:rPr>
-          <w:rFonts w:ascii="Arial" w:hAnsi="Arial"/>
-          <w:sz w:val="18"/>
-        </w:rPr>
-        <w:t>payload</w:t>
-      </w:r>
-      <w:proofErr w:type="spellEnd"/>
-      <w:r>
-        <w:rPr>
-          <w:rFonts w:ascii="Arial" w:hAnsi="Arial"/>
-          <w:sz w:val="18"/>
-        </w:rPr>
-        <w:t xml:space="preserve">, </w:t>
-      </w:r>
-      <w:proofErr w:type="spellStart"/>
-      <w:r>
-        <w:rPr>
-          <w:rFonts w:ascii="Arial" w:hAnsi="Arial"/>
-          <w:sz w:val="18"/>
-        </w:rPr>
-        <w:t>current_values</w:t>
-      </w:r>
-      <w:proofErr w:type="spellEnd"/>
-      <w:r>
-        <w:rPr>
-          <w:rFonts w:ascii="Arial" w:hAnsi="Arial"/>
-          <w:sz w:val="18"/>
-        </w:rPr>
-        <w:t>)</w:t>
-      </w:r>
-      <w:r>
-        <w:t xml:space="preserve">; </w:t>
-      </w:r>
-      <w:proofErr w:type="spellStart"/>
-      <w:proofErr w:type="gramStart"/>
-      <w:r>
-        <w:rPr>
-          <w:rFonts w:ascii="Arial" w:hAnsi="Arial"/>
-          <w:sz w:val="18"/>
-        </w:rPr>
-        <w:t>EvaluationRecord</w:t>
-      </w:r>
-      <w:proofErr w:type="spellEnd"/>
-      <w:r>
-        <w:rPr>
-          <w:rFonts w:ascii="Arial" w:hAnsi="Arial"/>
-          <w:sz w:val="18"/>
-        </w:rPr>
-        <w:t>(</w:t>
-      </w:r>
-      <w:proofErr w:type="gramEnd"/>
-      <w:r>
-        <w:rPr>
-          <w:rFonts w:ascii="Arial" w:hAnsi="Arial"/>
-          <w:sz w:val="18"/>
-        </w:rPr>
-        <w:t xml:space="preserve">case, </w:t>
-      </w:r>
-      <w:proofErr w:type="spellStart"/>
-      <w:r>
-        <w:rPr>
-          <w:rFonts w:ascii="Arial" w:hAnsi="Arial"/>
-          <w:sz w:val="18"/>
-        </w:rPr>
-        <w:t>case_version</w:t>
-      </w:r>
-      <w:proofErr w:type="spellEnd"/>
-      <w:r>
-        <w:rPr>
-          <w:rFonts w:ascii="Arial" w:hAnsi="Arial"/>
-          <w:sz w:val="18"/>
-        </w:rPr>
-        <w:t xml:space="preserve">, inputs, </w:t>
-      </w:r>
-      <w:proofErr w:type="spellStart"/>
-      <w:r>
-        <w:rPr>
-          <w:rFonts w:ascii="Arial" w:hAnsi="Arial"/>
-          <w:sz w:val="18"/>
-        </w:rPr>
-        <w:t>policy</w:t>
-      </w:r>
-      <w:proofErr w:type="spellEnd"/>
-      <w:r>
-        <w:rPr>
-          <w:rFonts w:ascii="Arial" w:hAnsi="Arial"/>
-          <w:sz w:val="18"/>
-        </w:rPr>
-        <w:t xml:space="preserve">, </w:t>
-      </w:r>
-      <w:proofErr w:type="spellStart"/>
-      <w:r>
-        <w:rPr>
-          <w:rFonts w:ascii="Arial" w:hAnsi="Arial"/>
-          <w:sz w:val="18"/>
-        </w:rPr>
-        <w:t>result</w:t>
-      </w:r>
-      <w:proofErr w:type="spellEnd"/>
-      <w:r>
-        <w:rPr>
-          <w:rFonts w:ascii="Arial" w:hAnsi="Arial"/>
-          <w:sz w:val="18"/>
-        </w:rPr>
-        <w:t>)</w:t>
-      </w:r>
-      <w:r>
-        <w:t xml:space="preserve"> conserva evaluación original; </w:t>
-      </w:r>
-      <w:proofErr w:type="spellStart"/>
-      <w:proofErr w:type="gramStart"/>
-      <w:r>
-        <w:rPr>
-          <w:rFonts w:ascii="Arial" w:hAnsi="Arial"/>
-          <w:sz w:val="18"/>
-        </w:rPr>
-        <w:t>InterventionRecord</w:t>
-      </w:r>
-      <w:proofErr w:type="spellEnd"/>
-      <w:r>
-        <w:rPr>
-          <w:rFonts w:ascii="Arial" w:hAnsi="Arial"/>
-          <w:sz w:val="18"/>
-        </w:rPr>
-        <w:t>(</w:t>
-      </w:r>
-      <w:proofErr w:type="gramEnd"/>
-      <w:r>
-        <w:rPr>
-          <w:rFonts w:ascii="Arial" w:hAnsi="Arial"/>
-          <w:sz w:val="18"/>
-        </w:rPr>
-        <w:t xml:space="preserve">case, </w:t>
-      </w:r>
-      <w:proofErr w:type="spellStart"/>
-      <w:r>
-        <w:rPr>
-          <w:rFonts w:ascii="Arial" w:hAnsi="Arial"/>
-          <w:sz w:val="18"/>
-        </w:rPr>
-        <w:t>version</w:t>
-      </w:r>
-      <w:proofErr w:type="spellEnd"/>
-      <w:r>
-        <w:rPr>
-          <w:rFonts w:ascii="Arial" w:hAnsi="Arial"/>
-          <w:sz w:val="18"/>
-        </w:rPr>
-        <w:t xml:space="preserve">, </w:t>
-      </w:r>
-      <w:proofErr w:type="spellStart"/>
-      <w:r>
-        <w:rPr>
-          <w:rFonts w:ascii="Arial" w:hAnsi="Arial"/>
-          <w:sz w:val="18"/>
-        </w:rPr>
-        <w:t>kind</w:t>
-      </w:r>
-      <w:proofErr w:type="spellEnd"/>
-      <w:r>
-        <w:rPr>
-          <w:rFonts w:ascii="Arial" w:hAnsi="Arial"/>
-          <w:sz w:val="18"/>
-        </w:rPr>
-        <w:t xml:space="preserve">, </w:t>
-      </w:r>
-      <w:proofErr w:type="spellStart"/>
-      <w:r>
-        <w:rPr>
-          <w:rFonts w:ascii="Arial" w:hAnsi="Arial"/>
-          <w:sz w:val="18"/>
-        </w:rPr>
-        <w:t>payload</w:t>
-      </w:r>
-      <w:proofErr w:type="spellEnd"/>
-      <w:r>
-        <w:rPr>
-          <w:rFonts w:ascii="Arial" w:hAnsi="Arial"/>
-          <w:sz w:val="18"/>
-        </w:rPr>
-        <w:t>)</w:t>
-      </w:r>
-      <w:r>
-        <w:t xml:space="preserve"> conserva decisiones/correcciones, autor declarado, fecha, motivo y discrepancia. La restricción caso/versión es única. El control de concurrencia CAS (compare-and-swap) verifica la versión esperada, incrementa la versión y agrega un evento en una sola transacción. La API y los modelos de historial impiden modificar o eliminar registros existentes; la modificación directa mediante SQL queda fuera de las garantías de esta demostración local.</w:t>
-      </w:r>
-    </w:p>
-    <w:p>
-      <w:r>
-        <w:rPr>
-          <w:b/>
-        </w:rPr>
-        <w:t>Estado funcional.</w:t>
-      </w:r>
-      <w:r>
-        <w:t xml:space="preserve"> F4 evalúa los casos de prueba y permite corregir entradas inválidas. F1 muestra archivos PDF y PNG con evidencia ficticia, registra decisiones y correcciones con motivos, detecta conflictos de versión y conserva el historial y los plazos. La validación </w:t>
-      </w:r>
-      <w:proofErr w:type="spellStart"/>
-      <w:r>
-        <w:t>extra-funcional</w:t>
-      </w:r>
-      <w:proofErr w:type="spellEnd"/>
-      <w:r>
-        <w:t xml:space="preserve"> AD-15 sigue pendiente; la identidad del operador es declarada y no dispone de autenticación para producción. Quedan fuera las nuevas evidencias, la reapertura completa, el panel agregado del supervisor, el motor real y F2/F3/F5…F9. Corregir el importe no recalcula la evaluación ni invalida una decisión anterior.</w:t>
-      </w:r>
-    </w:p>
-    <w:p>
-      <w:r>
-        <w:rPr>
-          <w:b/>
-        </w:rPr>
-        <w:t>Interfaz.</w:t>
-      </w:r>
-      <w:r>
-        <w:t xml:space="preserve"> Capturas del candidato: F4, F1</w:t>
-      </w:r>
-      <w:r>
-        <w:t>.</w:t>
-      </w:r>
-    </w:p>
-    <w:p>
-      <w:r>
-        <w:rPr>
-          <w:b/>
-        </w:rPr>
-        <w:t>Procedencia del código.</w:t>
-      </w:r>
-      <w:r>
-        <w:t xml:space="preserve"> No se implementaron líneas de código directamente por el equipo; en cambio, el equipo realizó correcciones sobre la implementación mediante revisiones e instrucciones canalizadas a través del agente LLM.</w:t>
-      </w:r>
-    </w:p>
-    <w:p>
-      <w:r>
-        <w:t xml:space="preserve">  </w:t>
-      </w:r>
-    </w:p>
-    <w:p/>
-    <w:p/>
-    <w:p/>
-    <w:p/>
-    <w:p/>
-    <w:p/>
-    <w:p/>
-    <w:p/>
-    <w:p>
-      <w:r>
-        <w:lastRenderedPageBreak/>
-        <w:drawing>
-          <wp:anchor distT="0" distB="0" distL="114300" distR="114300" simplePos="0" relativeHeight="251699712" behindDoc="0" locked="0" layoutInCell="1" allowOverlap="1" wp14:anchorId="5F72CFE7" wp14:editId="1F76AC5B">
-            <wp:simplePos x="0" y="0"/>
-            <wp:positionH relativeFrom="column">
-              <wp:posOffset>463648</wp:posOffset>
-            </wp:positionH>
-            <wp:positionV relativeFrom="paragraph">
-              <wp:posOffset>-293712</wp:posOffset>
-            </wp:positionV>
-            <wp:extent cx="5181600" cy="3684636"/>
-            <wp:effectExtent l="0" t="0" r="0" b="0"/>
-            <wp:wrapNone/>
-            <wp:docPr id="2" name="Picture 2"/>
-            <wp:cNvGraphicFramePr>
-              <a:graphicFrameLocks xmlns:a="http://schemas.openxmlformats.org/drawingml/2006/main" noChangeAspect="1"/>
-            </wp:cNvGraphicFramePr>
-            <a:graphic xmlns:a="http://schemas.openxmlformats.org/drawingml/2006/main">
-              <a:graphicData uri="http://schemas.openxmlformats.org/drawingml/2006/picture">
-                <pic:pic xmlns:pic="http://schemas.openxmlformats.org/drawingml/2006/picture">
-                  <pic:nvPicPr>
-                    <pic:cNvPr id="0" name="f4.png"/>
-                    <pic:cNvPicPr/>
-                  </pic:nvPicPr>
-                  <pic:blipFill>
-                    <a:blip r:embed="rId9"/>
-                    <a:stretch>
-                      <a:fillRect/>
-                    </a:stretch>
-                  </pic:blipFill>
-                  <pic:spPr>
-                    <a:xfrm>
-                      <a:off x="0" y="0"/>
-                      <a:ext cx="5181600" cy="3684636"/>
-                    </a:xfrm>
-                    <a:prstGeom prst="rect">
-                      <a:avLst/>
-                    </a:prstGeom>
-                  </pic:spPr>
-                </pic:pic>
-              </a:graphicData>
-            </a:graphic>
-            <wp14:sizeRelH relativeFrom="margin">
-              <wp14:pctWidth>0</wp14:pctWidth>
-            </wp14:sizeRelH>
-            <wp14:sizeRelV relativeFrom="margin">
-              <wp14:pctHeight>0</wp14:pctHeight>
-            </wp14:sizeRelV>
-          </wp:anchor>
-        </w:drawing>
-      </w:r>
-    </w:p>
-    <w:p/>
-    <w:p/>
-    <w:p/>
-    <w:p/>
-    <w:p/>
-    <w:p/>
-    <w:p/>
-    <w:p/>
-    <w:p/>
-    <w:p/>
-    <w:p/>
-    <w:p/>
-    <w:p/>
-    <w:p>
-      <w:r>
-        <w:drawing>
-          <wp:anchor distT="0" distB="0" distL="114300" distR="114300" simplePos="0" relativeHeight="251674112" behindDoc="0" locked="0" layoutInCell="1" allowOverlap="1" wp14:anchorId="19EA350B" wp14:editId="4D3333C0">
-            <wp:simplePos x="0" y="0"/>
-            <wp:positionH relativeFrom="column">
-              <wp:posOffset>478253</wp:posOffset>
-            </wp:positionH>
-            <wp:positionV relativeFrom="paragraph">
-              <wp:posOffset>11088</wp:posOffset>
-            </wp:positionV>
-            <wp:extent cx="5193323" cy="3693123"/>
-            <wp:effectExtent l="0" t="0" r="7620" b="3175"/>
-            <wp:wrapNone/>
-            <wp:docPr id="3" name="Picture 3"/>
-            <wp:cNvGraphicFramePr>
-              <a:graphicFrameLocks xmlns:a="http://schemas.openxmlformats.org/drawingml/2006/main" noChangeAspect="1"/>
-            </wp:cNvGraphicFramePr>
-            <a:graphic xmlns:a="http://schemas.openxmlformats.org/drawingml/2006/main">
-              <a:graphicData uri="http://schemas.openxmlformats.org/drawingml/2006/picture">
-                <pic:pic xmlns:pic="http://schemas.openxmlformats.org/drawingml/2006/picture">
-                  <pic:nvPicPr>
-                    <pic:cNvPr id="0" name="f1.png"/>
-                    <pic:cNvPicPr/>
-                  </pic:nvPicPr>
-                  <pic:blipFill>
-                    <a:blip r:embed="rId10"/>
-                    <a:stretch>
-                      <a:fillRect/>
-                    </a:stretch>
-                  </pic:blipFill>
-                  <pic:spPr>
-                    <a:xfrm>
-                      <a:off x="0" y="0"/>
-                      <a:ext cx="5193323" cy="3693123"/>
-                    </a:xfrm>
-                    <a:prstGeom prst="rect">
-                      <a:avLst/>
-                    </a:prstGeom>
-                  </pic:spPr>
-                </pic:pic>
-              </a:graphicData>
-            </a:graphic>
-            <wp14:sizeRelH relativeFrom="margin">
-              <wp14:pctWidth>0</wp14:pctWidth>
-            </wp14:sizeRelH>
-            <wp14:sizeRelV relativeFrom="margin">
-              <wp14:pctHeight>0</wp14:pctHeight>
-            </wp14:sizeRelV>
-          </wp:anchor>
-        </w:drawing>
-      </w:r>
-    </w:p>
-    <w:p/>
-    <w:p/>
-    <w:p/>
-    <w:p/>
-    <w:p/>
-    <w:p/>
-    <w:p/>
-    <w:p/>
-    <w:p/>
-    <w:p/>
-    <w:p/>
-    <w:p/>
-    <w:p/>
-    <w:p/>
-    <w:p/>
-    <w:p>
-      <w:pPr>
-        <w:pStyle w:val="Descripcin"/>
-        <w:jc w:val="center"/>
-      </w:pPr>
-      <w:r>
-        <w:t>Figuras 2 y 3 Interfaces F4 y F1 ampliadas en el anexo</w:t>
-      </w:r>
-    </w:p>
-    <w:p>
-      <w:r>
-        <w:br w:type="page"/>
-      </w:r>
-    </w:p>
-    <w:p>
-      <w:pPr>
-        <w:pStyle w:val="Ttulo1"/>
-      </w:pPr>
-      <w:r>
-        <w:rPr>
-          <w:noProof/>
-        </w:rPr>
-        <w:lastRenderedPageBreak/>
-        <w:drawing>
-          <wp:inline distT="0" distB="0" distL="0" distR="0" wp14:anchorId="2612B3B8" wp14:editId="6AA2B7F9">
-            <wp:extent cx="6130925" cy="3065780"/>
-            <wp:effectExtent l="0" t="0" r="3175" b="1270"/>
-            <wp:docPr id="738890409" name="Imagen 1"/>
-            <wp:cNvGraphicFramePr>
-              <a:graphicFrameLocks xmlns:a="http://schemas.openxmlformats.org/drawingml/2006/main" noChangeAspect="1"/>
-            </wp:cNvGraphicFramePr>
-            <a:graphic xmlns:a="http://schemas.openxmlformats.org/drawingml/2006/main">
-              <a:graphicData uri="http://schemas.openxmlformats.org/drawingml/2006/picture">
-                <pic:pic xmlns:pic="http://schemas.openxmlformats.org/drawingml/2006/picture">
-                  <pic:nvPicPr>
-                    <pic:cNvPr id="0" name="Picture 1"/>
-                    <pic:cNvPicPr>
-                      <a:picLocks noChangeAspect="1" noChangeArrowheads="1"/>
-                    </pic:cNvPicPr>
-                  </pic:nvPicPr>
-                  <pic:blipFill>
-                    <a:blip r:embed="rId11">
-                      <a:extLst>
-                        <a:ext uri="{28A0092B-C50C-407E-A947-70E740481C1C}">
-                          <a14:useLocalDpi xmlns:a14="http://schemas.microsoft.com/office/drawing/2010/main" val="0"/>
-                        </a:ext>
-                      </a:extLst>
-                    </a:blip>
-                    <a:srcRect/>
-                    <a:stretch>
-                      <a:fillRect/>
-                    </a:stretch>
-                  </pic:blipFill>
-                  <pic:spPr bwMode="auto">
-                    <a:xfrm>
-                      <a:off x="0" y="0"/>
-                      <a:ext cx="6130925" cy="3065780"/>
-                    </a:xfrm>
-                    <a:prstGeom prst="rect">
-                      <a:avLst/>
-                    </a:prstGeom>
-                    <a:noFill/>
-                    <a:ln>
-                      <a:noFill/>
-                    </a:ln>
+                    <a:prstGeom prst="rect"/>
                   </pic:spPr>
                 </pic:pic>
               </a:graphicData>
@@ -2049,65 +1640,394 @@
           </wp:inline>
         </w:drawing>
       </w:r>
-      <w:r>
-        <w:t>6.5 Pruebas y verificación</w:t>
-      </w:r>
     </w:p>
     <w:p>
       <w:pPr>
-        <w:pStyle w:val="Ttulo2"/>
-      </w:pPr>
-      <w:r>
-        <w:t>Pruebas funcionales y extremo a extremo</w:t>
+        <w:pStyle w:val="Descripcin"/>
+        <w:jc w:val="center"/>
+      </w:pPr>
+      <w:r>
+        <w:t>Figura 1 Arquitectura del incremento</w:t>
       </w:r>
     </w:p>
     <w:p>
-      <w:r>
-        <w:t xml:space="preserve">El cierre técnico publicado registra </w:t>
-      </w:r>
+      <w:pPr>
+        <w:keepLines w:val="0"/>
+        <w:widowControl/>
+        <w:spacing w:after="120"/>
+      </w:pPr>
       <w:r>
         <w:rPr>
           <w:b/>
         </w:rPr>
-        <w:t xml:space="preserve">33 pruebas Django y 8 </w:t>
+        <w:t>Modelo efectivo.</w:t>
+      </w:r>
+      <w:r>
+        <w:t xml:space="preserve"> </w:t>
       </w:r>
       <w:proofErr w:type="spellStart"/>
+      <w:proofErr w:type="gramStart"/>
+      <w:r>
+        <w:rPr>
+          <w:rFonts w:ascii="Arial" w:hAnsi="Arial"/>
+          <w:sz w:val="18"/>
+        </w:rPr>
+        <w:t>CaseRecord</w:t>
+      </w:r>
+      <w:proofErr w:type="spellEnd"/>
+      <w:r>
+        <w:rPr>
+          <w:rFonts w:ascii="Arial" w:hAnsi="Arial"/>
+          <w:sz w:val="18"/>
+        </w:rPr>
+        <w:t>(</w:t>
+      </w:r>
+      <w:proofErr w:type="spellStart"/>
+      <w:proofErr w:type="gramEnd"/>
+      <w:r>
+        <w:rPr>
+          <w:rFonts w:ascii="Arial" w:hAnsi="Arial"/>
+          <w:sz w:val="18"/>
+        </w:rPr>
+        <w:t>case_id</w:t>
+      </w:r>
+      <w:proofErr w:type="spellEnd"/>
+      <w:r>
+        <w:rPr>
+          <w:rFonts w:ascii="Arial" w:hAnsi="Arial"/>
+          <w:sz w:val="18"/>
+        </w:rPr>
+        <w:t xml:space="preserve">, </w:t>
+      </w:r>
+      <w:proofErr w:type="spellStart"/>
+      <w:r>
+        <w:rPr>
+          <w:rFonts w:ascii="Arial" w:hAnsi="Arial"/>
+          <w:sz w:val="18"/>
+        </w:rPr>
+        <w:t>version</w:t>
+      </w:r>
+      <w:proofErr w:type="spellEnd"/>
+      <w:r>
+        <w:rPr>
+          <w:rFonts w:ascii="Arial" w:hAnsi="Arial"/>
+          <w:sz w:val="18"/>
+        </w:rPr>
+        <w:t xml:space="preserve">, </w:t>
+      </w:r>
+      <w:proofErr w:type="spellStart"/>
+      <w:r>
+        <w:rPr>
+          <w:rFonts w:ascii="Arial" w:hAnsi="Arial"/>
+          <w:sz w:val="18"/>
+        </w:rPr>
+        <w:t>payload</w:t>
+      </w:r>
+      <w:proofErr w:type="spellEnd"/>
+      <w:r>
+        <w:rPr>
+          <w:rFonts w:ascii="Arial" w:hAnsi="Arial"/>
+          <w:sz w:val="18"/>
+        </w:rPr>
+        <w:t xml:space="preserve">, </w:t>
+      </w:r>
+      <w:proofErr w:type="spellStart"/>
+      <w:r>
+        <w:rPr>
+          <w:rFonts w:ascii="Arial" w:hAnsi="Arial"/>
+          <w:sz w:val="18"/>
+        </w:rPr>
+        <w:t>current_values</w:t>
+      </w:r>
+      <w:proofErr w:type="spellEnd"/>
+      <w:r>
+        <w:rPr>
+          <w:rFonts w:ascii="Arial" w:hAnsi="Arial"/>
+          <w:sz w:val="18"/>
+        </w:rPr>
+        <w:t>)</w:t>
+      </w:r>
+      <w:r>
+        <w:t xml:space="preserve">; </w:t>
+      </w:r>
+      <w:proofErr w:type="spellStart"/>
+      <w:proofErr w:type="gramStart"/>
+      <w:r>
+        <w:rPr>
+          <w:rFonts w:ascii="Arial" w:hAnsi="Arial"/>
+          <w:sz w:val="18"/>
+        </w:rPr>
+        <w:t>EvaluationRecord</w:t>
+      </w:r>
+      <w:proofErr w:type="spellEnd"/>
+      <w:r>
+        <w:rPr>
+          <w:rFonts w:ascii="Arial" w:hAnsi="Arial"/>
+          <w:sz w:val="18"/>
+        </w:rPr>
+        <w:t>(</w:t>
+      </w:r>
+      <w:proofErr w:type="gramEnd"/>
+      <w:r>
+        <w:rPr>
+          <w:rFonts w:ascii="Arial" w:hAnsi="Arial"/>
+          <w:sz w:val="18"/>
+        </w:rPr>
+        <w:t xml:space="preserve">case, </w:t>
+      </w:r>
+      <w:proofErr w:type="spellStart"/>
+      <w:r>
+        <w:rPr>
+          <w:rFonts w:ascii="Arial" w:hAnsi="Arial"/>
+          <w:sz w:val="18"/>
+        </w:rPr>
+        <w:t>case_version</w:t>
+      </w:r>
+      <w:proofErr w:type="spellEnd"/>
+      <w:r>
+        <w:rPr>
+          <w:rFonts w:ascii="Arial" w:hAnsi="Arial"/>
+          <w:sz w:val="18"/>
+        </w:rPr>
+        <w:t xml:space="preserve">, inputs, </w:t>
+      </w:r>
+      <w:proofErr w:type="spellStart"/>
+      <w:r>
+        <w:rPr>
+          <w:rFonts w:ascii="Arial" w:hAnsi="Arial"/>
+          <w:sz w:val="18"/>
+        </w:rPr>
+        <w:t>policy</w:t>
+      </w:r>
+      <w:proofErr w:type="spellEnd"/>
+      <w:r>
+        <w:rPr>
+          <w:rFonts w:ascii="Arial" w:hAnsi="Arial"/>
+          <w:sz w:val="18"/>
+        </w:rPr>
+        <w:t xml:space="preserve">, </w:t>
+      </w:r>
+      <w:proofErr w:type="spellStart"/>
+      <w:r>
+        <w:rPr>
+          <w:rFonts w:ascii="Arial" w:hAnsi="Arial"/>
+          <w:sz w:val="18"/>
+        </w:rPr>
+        <w:t>result</w:t>
+      </w:r>
+      <w:proofErr w:type="spellEnd"/>
+      <w:r>
+        <w:rPr>
+          <w:rFonts w:ascii="Arial" w:hAnsi="Arial"/>
+          <w:sz w:val="18"/>
+        </w:rPr>
+        <w:t>)</w:t>
+      </w:r>
+      <w:r>
+        <w:t xml:space="preserve"> conserva evaluación original; </w:t>
+      </w:r>
+      <w:proofErr w:type="spellStart"/>
+      <w:proofErr w:type="gramStart"/>
+      <w:r>
+        <w:rPr>
+          <w:rFonts w:ascii="Arial" w:hAnsi="Arial"/>
+          <w:sz w:val="18"/>
+        </w:rPr>
+        <w:t>InterventionRecord</w:t>
+      </w:r>
+      <w:proofErr w:type="spellEnd"/>
+      <w:r>
+        <w:rPr>
+          <w:rFonts w:ascii="Arial" w:hAnsi="Arial"/>
+          <w:sz w:val="18"/>
+        </w:rPr>
+        <w:t>(</w:t>
+      </w:r>
+      <w:proofErr w:type="gramEnd"/>
+      <w:r>
+        <w:rPr>
+          <w:rFonts w:ascii="Arial" w:hAnsi="Arial"/>
+          <w:sz w:val="18"/>
+        </w:rPr>
+        <w:t xml:space="preserve">case, </w:t>
+      </w:r>
+      <w:proofErr w:type="spellStart"/>
+      <w:r>
+        <w:rPr>
+          <w:rFonts w:ascii="Arial" w:hAnsi="Arial"/>
+          <w:sz w:val="18"/>
+        </w:rPr>
+        <w:t>version</w:t>
+      </w:r>
+      <w:proofErr w:type="spellEnd"/>
+      <w:r>
+        <w:rPr>
+          <w:rFonts w:ascii="Arial" w:hAnsi="Arial"/>
+          <w:sz w:val="18"/>
+        </w:rPr>
+        <w:t xml:space="preserve">, </w:t>
+      </w:r>
+      <w:proofErr w:type="spellStart"/>
+      <w:r>
+        <w:rPr>
+          <w:rFonts w:ascii="Arial" w:hAnsi="Arial"/>
+          <w:sz w:val="18"/>
+        </w:rPr>
+        <w:t>kind</w:t>
+      </w:r>
+      <w:proofErr w:type="spellEnd"/>
+      <w:r>
+        <w:rPr>
+          <w:rFonts w:ascii="Arial" w:hAnsi="Arial"/>
+          <w:sz w:val="18"/>
+        </w:rPr>
+        <w:t xml:space="preserve">, </w:t>
+      </w:r>
+      <w:proofErr w:type="spellStart"/>
+      <w:r>
+        <w:rPr>
+          <w:rFonts w:ascii="Arial" w:hAnsi="Arial"/>
+          <w:sz w:val="18"/>
+        </w:rPr>
+        <w:t>payload</w:t>
+      </w:r>
+      <w:proofErr w:type="spellEnd"/>
+      <w:r>
+        <w:rPr>
+          <w:rFonts w:ascii="Arial" w:hAnsi="Arial"/>
+          <w:sz w:val="18"/>
+        </w:rPr>
+        <w:t>)</w:t>
+      </w:r>
+      <w:r>
+        <w:t xml:space="preserve"> conserva decisiones/correcciones, autor declarado, fecha, motivo y discrepancia. La restricción caso/versión es única. El control de concurrencia CAS (compare-and-swap) verifica la versión esperada, incrementa la versión y agrega un evento en una sola transacción. La API y los modelos de historial impiden modificar o eliminar registros existentes; la modificación directa mediante SQL queda fuera de las garantías de esta demostración local.</w:t>
+      </w:r>
+    </w:p>
+    <w:p>
+      <w:pPr>
+        <w:keepLines w:val="0"/>
+        <w:widowControl/>
+        <w:spacing w:after="120"/>
+      </w:pPr>
       <w:r>
         <w:rPr>
           <w:b/>
         </w:rPr>
-        <w:t>pytest</w:t>
+        <w:t>Estado funcional.</w:t>
+      </w:r>
+      <w:r>
+        <w:t xml:space="preserve"> F4 evalúa los casos de prueba y permite corregir entradas inválidas. F1 muestra archivos PDF y PNG con evidencia ficticia, registra decisiones y correcciones con motivos, detecta conflictos de versión y conserva el historial y los plazos. La validación </w:t>
+      </w:r>
+      <w:proofErr w:type="spellStart"/>
+      <w:r>
+        <w:t>extra-funcional</w:t>
       </w:r>
       <w:proofErr w:type="spellEnd"/>
+      <w:r>
+        <w:t xml:space="preserve"> AD-15 sigue pendiente; la identidad del operador es declarada y no dispone de autenticación para producción. Quedan fuera las nuevas evidencias, la reapertura completa, el panel agregado del supervisor, el motor real y F2/F3/F5…F9. Corregir el importe no recalcula la evaluación ni invalida una decisión anterior.</w:t>
+      </w:r>
+    </w:p>
+    <w:p>
+      <w:pPr>
+        <w:keepLines w:val="0"/>
+        <w:widowControl/>
+        <w:spacing w:after="120"/>
+      </w:pPr>
+      <w:r>
+        <w:t>Interfaz revisada. Se conserva la identidad clara y verde, con nombres completos, acción «Evaluar caso», ocho columnas de bandeja, controles mejor alineados y separación de decisión, corrección e historial. Los estados humanos se diferencian por texto y color; los errores se vinculan a controles y reciben foco. Los campos introducidos se conservan al fallar un envío. Las capturas actuales se presentan en el anexo A [R13].</w:t>
+      </w:r>
+    </w:p>
+    <w:p>
+      <w:pPr>
+        <w:keepLines w:val="0"/>
+        <w:widowControl/>
+        <w:spacing w:after="120"/>
+      </w:pPr>
       <w:r>
         <w:rPr>
           <w:b/>
         </w:rPr>
-        <w:t xml:space="preserve"> aprobadas</w:t>
-      </w:r>
-      <w:r>
-        <w:t>. Las pruebas funcionales derivadas de PF-04 cubren CC-F4-01 a 09: fronteras 59,99/60/90/90,01, fraude, señal menor de 70 o ausente, automatización desactivada y error. Los valores no numéricos NaN y los infinitos se incluyen como entradas inválidas para evitar aprobación accidental. PF-05 prueba motivo obligatorio, categorías compatibles, Otro con comentario, corrección 120000 a 100000 y conflicto de versión. PF-14 conserva plazos y vencidos abiertos. Son precisiones ejecutables de los criterios E1.</w:t>
+        <w:t>Procedencia del código.</w:t>
+      </w:r>
+      <w:r>
+        <w:t xml:space="preserve"> No se implementaron líneas de código directamente por el equipo; en cambio, el equipo realizó correcciones sobre la implementación mediante revisiones e instrucciones canalizadas a través del agente LLM.</w:t>
       </w:r>
     </w:p>
     <w:p>
-      <w:proofErr w:type="spellStart"/>
-      <w:r>
-        <w:t>Chromium</w:t>
-      </w:r>
-      <w:proofErr w:type="spellEnd"/>
-      <w:r>
-        <w:t xml:space="preserve"> recorre F4 con recuperación de error y F1 con evidencia, corrección, solicitud y conflicto, por lo que existe un recorrido E2E de ambas funcionalidades en la interfaz. Dos conexiones SQLite verifican modificaciones concurrentes y procesos nuevos comprueban persistencia. PX-09 alcanza las nueve salidas del corpus.</w:t>
+      <w:pPr>
+        <w:pStyle w:val="Descripcin"/>
+        <w:jc w:val="center"/>
+      </w:pPr>
+      <w:r>
+        <w:t>Figuras 2 a 4 Interfaces actuales de F4, bandeja F1 y detalle del caso, en el anexo A</w:t>
       </w:r>
     </w:p>
     <w:p>
       <w:pPr>
-        <w:pStyle w:val="Ttulo2"/>
-      </w:pPr>
-      <w:r>
-        <w:t>Rendimiento y aceptación de la desviación</w:t>
+        <w:keepLines w:val="0"/>
+        <w:widowControl/>
+        <w:spacing w:after="120"/>
+      </w:pPr>
+      <w:r>
+        <w:br w:type="page"/>
       </w:r>
     </w:p>
     <w:p>
+      <w:pPr>
+        <w:pStyle w:val="Ttulo1"/>
+      </w:pPr>
+      <w:r>
+        <w:rPr>
+          <w:noProof/>
+        </w:rPr>
+        <w:lastRenderedPageBreak/>
+      </w:r>
+      <w:r>
+        <w:t>6.5 Pruebas y verificación</w:t>
+      </w:r>
+    </w:p>
+    <w:p>
+      <w:pPr>
+        <w:pStyle w:val="Ttulo2"/>
+      </w:pPr>
+      <w:r>
+        <w:t>Pruebas funcionales y extremo a extremo</w:t>
+      </w:r>
+    </w:p>
+    <w:p>
+      <w:pPr>
+        <w:keepLines w:val="0"/>
+        <w:widowControl/>
+        <w:spacing w:after="120"/>
+      </w:pPr>
+      <w:r>
+        <w:t>El cierre técnico anterior registra 33 pruebas Django y ocho pytest aprobadas. PF-04 cubre CC-F4-01 a 09: fronteras 59,99/60/90/90,01, fraude, señales menores de 70 o ausentes, automatización desactivada y error. NaN e infinitos se tratan como entradas inválidas. PF-05 prueba motivos compatibles, Otro con comentario, corrección de 120000 a 100000 y conflicto de versión. PF-14 verifica plazos y casos vencidos abiertos. Son resultados históricos y no se presentan como ejecución de toda la suite sobre la revisión local.</w:t>
+      </w:r>
+    </w:p>
+    <w:p>
+      <w:pPr>
+        <w:keepLines w:val="0"/>
+        <w:widowControl/>
+        <w:spacing w:after="120"/>
+      </w:pPr>
+      <w:r>
+        <w:t>En la revisión local se aprobaron 33 pruebas Django y siete pruebas pytest seleccionadas [R13]. El recorrido integrado de Chromium verifica las nueve salidas F4, recuperación de error, PDF/PNG, corrección, solicitud y conflicto entre sesiones. La prueba nueva de UX recorre tres pantallas a 320, 360, 390, 768 y 1366 px sin desbordamiento global; comprueba navegación móvil, encabezados accesibles, evidencia antes del puntaje, casilla de discrepancia, Tab/Shift+Tab y foco en errores. Las pruebas usan una base aislada. El conteo de siete no reemplaza el histórico de ocho ni implica ejecución de toda la suite.</w:t>
+      </w:r>
+    </w:p>
+    <w:p>
+      <w:pPr>
+        <w:pStyle w:val="Ttulo2"/>
+      </w:pPr>
+      <w:r>
+        <w:t>Rendimiento y aceptación de la desviación</w:t>
+      </w:r>
+    </w:p>
+    <w:p>
+      <w:pPr>
+        <w:keepLines w:val="0"/>
+        <w:widowControl/>
+        <w:spacing w:after="120"/>
+      </w:pPr>
       <w:r>
         <w:t>Se midieron 100 casos con tres evidencias, cinco calentamientos y 30 muestras. Los recursos se observaron durante 30 revisiones, con 84 muestras y sin brechas de contadores [R3].</w:t>
       </w:r>
@@ -2569,25 +2489,30 @@
     </w:tbl>
     <w:p>
       <w:pPr>
-        <w:spacing w:after="40"/>
-      </w:pPr>
+        <w:keepLines w:val="0"/>
+        <w:widowControl/>
+        <w:spacing w:after="120"/>
+      </w:pPr>
+      <w:r>
+        <w:t>El cliente acepta el rendimiento actual sin observaciones, incluida la desviación de CPU [R6]. Se conserva el umbral original; no se atribuye el exceso a error de medición.</w:t>
+      </w:r>
     </w:p>
     <w:p>
-      <w:r>
-        <w:t>El cliente acepta el rendimiento actual sin observaciones, incluida la desviación de CPU [R6]. Se conserva el umbral original; no se atribuye el exceso a error de medición.</w:t>
+      <w:pPr>
+        <w:pStyle w:val="Ttulo2"/>
+      </w:pPr>
+      <w:r>
+        <w:t>Usabilidad y aceptación funcional</w:t>
       </w:r>
     </w:p>
     <w:p>
       <w:pPr>
-        <w:pStyle w:val="Ttulo2"/>
-      </w:pPr>
-      <w:r>
-        <w:t>Usabilidad y aceptación funcional</w:t>
-      </w:r>
-    </w:p>
-    <w:p>
-      <w:r>
-        <w:t>Dos participantes externas al proyecto completaron una tarea F4 de evaluación y explicación y una tarea F1 de revisión de evidencia y solicitud de antecedentes. El equipo confirmó que los datos del acta corresponden a sesiones realizadas [R4]. Esta evidencia se informa como validación.</w:t>
+        <w:keepLines w:val="0"/>
+        <w:widowControl/>
+        <w:spacing w:after="120"/>
+      </w:pPr>
+      <w:r>
+        <w:t>Dos participantes externas completaron tareas F4 y F1 en la interfaz anterior, según el acta histórica [R4]. Sus tiempos y asistencias se conservan en la tabla.</w:t>
       </w:r>
     </w:p>
     <w:tbl>
@@ -3033,21 +2958,20 @@
     </w:tbl>
     <w:p>
       <w:pPr>
-        <w:spacing w:after="40"/>
-      </w:pPr>
+        <w:keepLines w:val="0"/>
+        <w:widowControl/>
+        <w:spacing w:after="120"/>
+      </w:pPr>
+      <w:r>
+        <w:t>Fernanda fue observada por Francisca el 04/10/2026 a las 11:05 y necesitó identificar botones y comprender secciones. Ximena fue observada por Lukas el 03/10/2026 a las 21:09, sin dificultades. Las ayudas observadas motivaron instrucciones más claras y separación de acciones.</w:t>
+      </w:r>
     </w:p>
     <w:p>
-      <w:r>
-        <w:t>Fernanda fue observada por Francisca el 04/10/2026 a las 11:05; necesitó identificar botones y comprender secciones. Ximena fue observada por Lukas el 03/10/2026 a las 21:09, sin dificultades.</w:t>
-      </w:r>
-      <w:r>
-        <w:t xml:space="preserve"> </w:t>
-      </w:r>
-      <w:r>
-        <w:t>Estos datos justifican mejorar la orientación de la interfaz; dos personas no permiten generalizar por edad.</w:t>
-      </w:r>
-    </w:p>
-    <w:p>
+      <w:pPr>
+        <w:keepLines w:val="0"/>
+        <w:widowControl/>
+        <w:spacing w:after="120"/>
+      </w:pPr>
       <w:r>
         <w:t xml:space="preserve">Sebastián probó F4/F1 el </w:t>
       </w:r>
@@ -3064,7 +2988,6 @@
         <w:t>.</w:t>
       </w:r>
     </w:p>
-    <w:p/>
     <w:tbl>
       <w:tblPr>
         <w:tblW w:w="0" w:type="auto"/>
@@ -3431,42 +3354,41 @@
     </w:tbl>
     <w:p>
       <w:pPr>
-        <w:spacing w:after="40"/>
-      </w:pPr>
+        <w:keepLines w:val="0"/>
+        <w:widowControl/>
+        <w:spacing w:after="120"/>
+      </w:pPr>
+      <w:r>
+        <w:t>No hubo rechazos en la sesión de aceptación registrada.</w:t>
+      </w:r>
     </w:p>
     <w:p>
-      <w:r>
-        <w:t>No se registraron rechazos en la sesión de aceptación. La aceptación global acredita la decisión del cliente sobre ambas funcionalidades, pero el acta no detalla la evaluación de cada criterio. Por tanto, no permite afirmar una aceptación individual de umbrales, motivos, conflictos y plazos. La reproducción técnica local pasó dependencias, migraciones, demo, 33 pruebas y acceso a ambas funciones. El README explica el proceso completo</w:t>
-      </w:r>
-      <w:r>
-        <w:t>.</w:t>
+      <w:pPr>
+        <w:keepLines w:val="0"/>
+        <w:widowControl/>
+        <w:spacing w:after="120"/>
+      </w:pPr>
+      <w:r>
+        <w:br w:type="page"/>
       </w:r>
     </w:p>
     <w:p>
-      <w:r>
-        <w:br w:type="page"/>
+      <w:pPr>
+        <w:pStyle w:val="Ttulo1"/>
+      </w:pPr>
+      <w:r>
+        <w:lastRenderedPageBreak/>
+        <w:t>6.6 Comparativa con la Entrega 1</w:t>
       </w:r>
     </w:p>
     <w:p>
       <w:pPr>
-        <w:pStyle w:val="Ttulo1"/>
-      </w:pPr>
-      <w:r>
-        <w:lastRenderedPageBreak/>
-        <w:t>6.6 Comparativa con la Entrega 1</w:t>
-      </w:r>
-    </w:p>
-    <w:p>
-      <w:r>
-        <w:t xml:space="preserve">El enunciado exige dos tablas y tres indicadores, pero no publica un formato completo ni sus fórmulas. La clasificación y métricas siguientes son propuestas explícitas para este informe, no una escala oficial. Se evalúa únicamente la </w:t>
-      </w:r>
-      <w:proofErr w:type="spellStart"/>
-      <w:r>
-        <w:t>baseline</w:t>
-      </w:r>
-      <w:proofErr w:type="spellEnd"/>
-      <w:r>
-        <w:t xml:space="preserve"> F4 y F1, sin afirmar cobertura de todo MIRA.</w:t>
+        <w:keepLines w:val="0"/>
+        <w:widowControl/>
+        <w:spacing w:after="120"/>
+      </w:pPr>
+      <w:r>
+        <w:t>Se evalúa únicamente la baseline F4 y F1, sin afirmar cobertura de todo MIRA.</w:t>
       </w:r>
     </w:p>
     <w:p>
@@ -4351,11 +4273,6 @@
     </w:tbl>
     <w:p>
       <w:pPr>
-        <w:spacing w:after="40"/>
-      </w:pPr>
-    </w:p>
-    <w:p>
-      <w:pPr>
         <w:pStyle w:val="Ttulo2"/>
       </w:pPr>
       <w:r>
@@ -5162,12 +5079,9 @@
     </w:tbl>
     <w:p>
       <w:pPr>
-        <w:spacing w:after="40"/>
-      </w:pPr>
-    </w:p>
-    <w:p>
-      <w:pPr>
-        <w:spacing w:after="40"/>
+        <w:keepLines w:val="0"/>
+        <w:widowControl/>
+        <w:spacing w:after="120"/>
         <w:rPr>
           <w:lang w:val="es-419"/>
         </w:rPr>
@@ -5196,7 +5110,9 @@
     </w:p>
     <w:p>
       <w:pPr>
-        <w:spacing w:after="40"/>
+        <w:keepLines w:val="0"/>
+        <w:widowControl/>
+        <w:spacing w:after="120"/>
         <w:rPr>
           <w:lang w:val="es-419"/>
         </w:rPr>
@@ -5210,7 +5126,9 @@
     </w:p>
     <w:p>
       <w:pPr>
-        <w:spacing w:after="40"/>
+        <w:keepLines w:val="0"/>
+        <w:widowControl/>
+        <w:spacing w:after="120"/>
         <w:rPr>
           <w:lang w:val="es-419"/>
         </w:rPr>
@@ -5238,46 +5156,28 @@
     </w:p>
     <w:p>
       <w:pPr>
-        <w:spacing w:after="40"/>
-      </w:pPr>
+        <w:pStyle w:val="Ttulo2"/>
+      </w:pPr>
+      <w:r>
+        <w:t>Indicadores calculados</w:t>
+      </w:r>
     </w:p>
     <w:p>
       <w:pPr>
-        <w:pStyle w:val="Ttulo2"/>
-      </w:pPr>
-      <w:r>
-        <w:t>Indicadores calculados</w:t>
+        <w:keepLines w:val="0"/>
+        <w:widowControl/>
+        <w:spacing w:after="120"/>
+      </w:pPr>
+      <w:r>
+        <w:t>I1 Cobertura de trazabilidad de Must seleccionados. En la línea base histórica, los Must con SPEC, historia, código y prueba divididos por los seleccionados son 7/7 × 100 = 100 % [R2]. Mide existencia de cadena, no cumplimiento de NFR-3. La matriz desarrolla 22 FR/NFR derivados.</w:t>
       </w:r>
     </w:p>
     <w:p>
-      <w:r>
-        <w:rPr>
-          <w:b/>
-        </w:rPr>
-        <w:t>I1 Cobertura de trazabilidad de Must seleccionados.</w:t>
-      </w:r>
-      <w:r>
-        <w:t xml:space="preserve"> Must de la </w:t>
-      </w:r>
-      <w:proofErr w:type="spellStart"/>
-      <w:r>
-        <w:t>baseline</w:t>
-      </w:r>
-      <w:proofErr w:type="spellEnd"/>
-      <w:r>
-        <w:t xml:space="preserve"> con SPEC, historia, código y prueba divididos por Must seleccionados: </w:t>
-      </w:r>
-      <w:r>
-        <w:rPr>
-          <w:b/>
-        </w:rPr>
-        <w:t>7/7 × 100 = 100 %</w:t>
-      </w:r>
-      <w:r>
-        <w:t xml:space="preserve"> [R2]. Mide existencia de cadena, no cumplimiento certificado de NFR-3. La matriz desarrolla 22 FR/NFR derivados.</w:t>
-      </w:r>
-    </w:p>
-    <w:p>
+      <w:pPr>
+        <w:keepLines w:val="0"/>
+        <w:widowControl/>
+        <w:spacing w:after="120"/>
+      </w:pPr>
       <w:r>
         <w:rPr>
           <w:b/>
@@ -5308,6 +5208,11 @@
       </w:r>
     </w:p>
     <w:p>
+      <w:pPr>
+        <w:keepLines w:val="0"/>
+        <w:widowControl/>
+        <w:spacing w:after="120"/>
+      </w:pPr>
       <w:r>
         <w:rPr>
           <w:b/>
@@ -5350,6 +5255,11 @@
       </w:r>
     </w:p>
     <w:p>
+      <w:pPr>
+        <w:keepLines w:val="0"/>
+        <w:widowControl/>
+        <w:spacing w:after="120"/>
+      </w:pPr>
       <w:r>
         <w:rPr>
           <w:b/>
@@ -5377,6 +5287,11 @@
       </w:r>
     </w:p>
     <w:p>
+      <w:pPr>
+        <w:keepLines w:val="0"/>
+        <w:widowControl/>
+        <w:spacing w:after="120"/>
+      </w:pPr>
       <w:r>
         <w:rPr>
           <w:b/>
@@ -5388,6 +5303,11 @@
       </w:r>
     </w:p>
     <w:p>
+      <w:pPr>
+        <w:keepLines w:val="0"/>
+        <w:widowControl/>
+        <w:spacing w:after="120"/>
+      </w:pPr>
       <w:r>
         <w:rPr>
           <w:b/>
@@ -5399,6 +5319,11 @@
       </w:r>
     </w:p>
     <w:p>
+      <w:pPr>
+        <w:keepLines w:val="0"/>
+        <w:widowControl/>
+        <w:spacing w:after="120"/>
+      </w:pPr>
       <w:r>
         <w:rPr>
           <w:b/>
@@ -5410,6 +5335,11 @@
       </w:r>
     </w:p>
     <w:p>
+      <w:pPr>
+        <w:keepLines w:val="0"/>
+        <w:widowControl/>
+        <w:spacing w:after="120"/>
+      </w:pPr>
       <w:r>
         <w:rPr>
           <w:b/>
@@ -5421,6 +5351,11 @@
       </w:r>
     </w:p>
     <w:p>
+      <w:pPr>
+        <w:keepLines w:val="0"/>
+        <w:widowControl/>
+        <w:spacing w:after="120"/>
+      </w:pPr>
       <w:r>
         <w:rPr>
           <w:b/>
@@ -5444,6 +5379,11 @@
       </w:r>
     </w:p>
     <w:p>
+      <w:pPr>
+        <w:keepLines w:val="0"/>
+        <w:widowControl/>
+        <w:spacing w:after="120"/>
+      </w:pPr>
       <w:r>
         <w:rPr>
           <w:b/>
@@ -5463,6 +5403,11 @@
       </w:r>
     </w:p>
     <w:p>
+      <w:pPr>
+        <w:keepLines w:val="0"/>
+        <w:widowControl/>
+        <w:spacing w:after="120"/>
+      </w:pPr>
       <w:r>
         <w:rPr>
           <w:b/>
@@ -5474,6 +5419,11 @@
       </w:r>
     </w:p>
     <w:p>
+      <w:pPr>
+        <w:keepLines w:val="0"/>
+        <w:widowControl/>
+        <w:spacing w:after="120"/>
+      </w:pPr>
       <w:r>
         <w:rPr>
           <w:b/>
@@ -5493,6 +5443,11 @@
       </w:r>
     </w:p>
     <w:p>
+      <w:pPr>
+        <w:keepLines w:val="0"/>
+        <w:widowControl/>
+        <w:spacing w:after="120"/>
+      </w:pPr>
       <w:r>
         <w:rPr>
           <w:b/>
@@ -5528,6 +5483,11 @@
       </w:r>
     </w:p>
     <w:p>
+      <w:pPr>
+        <w:keepLines w:val="0"/>
+        <w:widowControl/>
+        <w:spacing w:after="120"/>
+      </w:pPr>
       <w:r>
         <w:rPr>
           <w:b/>
@@ -5539,11 +5499,21 @@
       </w:r>
     </w:p>
     <w:p>
+      <w:pPr>
+        <w:keepLines w:val="0"/>
+        <w:widowControl/>
+        <w:spacing w:after="120"/>
+      </w:pPr>
       <w:r>
         <w:t>El cierre técnico fue revisado con cuatro lentes BMAD; los hallazgos, refutaciones y parches están en registro de revisión. No hubo hallazgos diferidos; las sesiones humanas se incorporan en los registros [R4/R5], mientras el entorno acordado sigue sin acreditar.</w:t>
       </w:r>
     </w:p>
     <w:p>
+      <w:pPr>
+        <w:keepLines w:val="0"/>
+        <w:widowControl/>
+        <w:spacing w:after="120"/>
+      </w:pPr>
       <w:r>
         <w:br w:type="page"/>
       </w:r>
@@ -5558,6 +5528,11 @@
       </w:r>
     </w:p>
     <w:p>
+      <w:pPr>
+        <w:keepLines w:val="0"/>
+        <w:widowControl/>
+        <w:spacing w:after="120"/>
+      </w:pPr>
       <w:r>
         <w:t xml:space="preserve">BMAD aportó una estructura útil para conservar la relación entre necesidades y comportamiento. La </w:t>
       </w:r>
@@ -5571,6 +5546,11 @@
       </w:r>
     </w:p>
     <w:p>
+      <w:pPr>
+        <w:keepLines w:val="0"/>
+        <w:widowControl/>
+        <w:spacing w:after="120"/>
+      </w:pPr>
       <w:r>
         <w:t xml:space="preserve">El método también generó mantenimiento sin comportamiento adicional. Las copias de SPEC y las referencias tecnológicas divergentes exigieron reconciliación. La existencia de documentos no demuestra coherencia: deben compararse con </w:t>
       </w:r>
@@ -5584,40 +5564,60 @@
       </w:r>
     </w:p>
     <w:p>
+      <w:pPr>
+        <w:keepLines w:val="0"/>
+        <w:widowControl/>
+        <w:spacing w:after="120"/>
+      </w:pPr>
       <w:r>
         <w:t>La validación con personas aporta otra clase de evidencia. Fernanda completó el recorrido con ayuda para localizar botones y entender secciones; Ximena lo resolvió sin asistencia. La diferencia señala una oportunidad de orientación, pero la muestra no permite afirmar que la interfaz es universalmente intuitiva ni establecer diferencias por edad. La aceptación global de Sebastián respalda la adecuación general a lo solicitado en la sesión registrada y conserva las dificultades de uso como oportunidades de mejora.</w:t>
       </w:r>
     </w:p>
     <w:p>
-      <w:r>
-        <w:t xml:space="preserve">El rendimiento exige separar satisfacción del cliente y acreditación técnica. El cliente acepta la desviación de CPU porque considera aceptable el resultado actual, mientras el requisito mantiene su umbral. Esta decisión no transforma el entorno medido en 2 </w:t>
-      </w:r>
-      <w:proofErr w:type="spellStart"/>
-      <w:r>
-        <w:t>vCPU</w:t>
-      </w:r>
-      <w:proofErr w:type="spellEnd"/>
-      <w:r>
-        <w:t xml:space="preserve"> y 4 GiB. Conservar ambos resultados permite justificar aceptación sin ocultar límites.</w:t>
+      <w:pPr>
+        <w:keepLines w:val="0"/>
+        <w:widowControl/>
+        <w:spacing w:after="120"/>
+      </w:pPr>
+      <w:r>
+        <w:t>El ciclo de mejora muestra cómo una observación de uso puede convertirse en cambios verificables: las ayudas para ubicar botones y entender secciones motivaron instrucciones, grupos y errores más claros. Las pruebas técnicas comprueban reflujo, foco y conservación de datos, pero no demuestran menor esfuerzo humano. Mantener esa diferencia evita declarar resuelto un problema de comprensión solo porque pasa una prueba automatizada.</w:t>
       </w:r>
     </w:p>
     <w:p>
-      <w:r>
-        <w:t xml:space="preserve">Frente al </w:t>
+      <w:pPr>
+        <w:keepLines w:val="0"/>
+        <w:widowControl/>
+        <w:spacing w:after="120"/>
+      </w:pPr>
+      <w:r>
+        <w:t xml:space="preserve">El rendimiento exige separar satisfacción del cliente y acreditación técnica. El cliente acepta la desviación de CPU porque considera aceptable el resultado actual, mientras el requisito mantiene su umbral. Esta decisión no transforma el entorno medido en 2 </w:t>
       </w:r>
       <w:proofErr w:type="spellStart"/>
       <w:r>
-        <w:t>prompting</w:t>
+        <w:t>vCPU</w:t>
       </w:r>
       <w:proofErr w:type="spellEnd"/>
       <w:r>
-        <w:t xml:space="preserve"> directo de E1, E2 añade código ejecutable, pruebas y control del historial; mejora la posibilidad de verificar decisiones y detectar pérdida entre especificación e implementación. No contamos con métricas comparables de horas o tokens para afirmar menor esfuerzo. SDD podría haber centrado el proceso en la especificación; en este proyecto, el control observable provino de revisar contratos y someterlos a pruebas además de organizar el trabajo por roles.</w:t>
+        <w:t xml:space="preserve"> y 4 GiB. Conservar ambos resultados permite justificar aceptación sin ocultar límites.</w:t>
       </w:r>
     </w:p>
     <w:p>
       <w:pPr>
-        <w:spacing w:after="200"/>
-      </w:pPr>
+        <w:keepLines w:val="0"/>
+        <w:widowControl/>
+        <w:spacing w:after="120"/>
+      </w:pPr>
+      <w:r>
+        <w:t xml:space="preserve">Frente al </w:t>
+      </w:r>
+      <w:proofErr w:type="spellStart"/>
+      <w:r>
+        <w:t>prompting</w:t>
+      </w:r>
+      <w:proofErr w:type="spellEnd"/>
+      <w:r>
+        <w:t xml:space="preserve"> directo de E1, E2 añade código ejecutable, pruebas y control del historial; mejora la posibilidad de verificar decisiones y detectar pérdida entre especificación e implementación. No contamos con métricas comparables de horas o tokens para afirmar menor esfuerzo. SDD podría haber centrado el proceso en la especificación; en este proyecto, el control observable provino de revisar contratos y someterlos a pruebas además de organizar el trabajo por roles.</w:t>
+      </w:r>
     </w:p>
     <w:p>
       <w:pPr>
@@ -5628,6 +5628,11 @@
       </w:r>
     </w:p>
     <w:p>
+      <w:pPr>
+        <w:keepLines w:val="0"/>
+        <w:widowControl/>
+        <w:spacing w:after="120"/>
+      </w:pPr>
       <w:r>
         <w:t xml:space="preserve">El incremento demuestra que el equipo ahora puede llevar una </w:t>
       </w:r>
@@ -5649,11 +5654,21 @@
       </w:r>
     </w:p>
     <w:p>
-      <w:r>
-        <w:t>F4 y F1 están disponibles y fueron aceptadas por Sebastián sin observaciones. Las sesiones externas aportaron tiempos y dificultades, y el cliente aceptó el rendimiento con una excepción de CPU. El README ofrece una secuencia completa de instalación y ejecución comprobada con caché local.</w:t>
+      <w:pPr>
+        <w:keepLines w:val="0"/>
+        <w:widowControl/>
+        <w:spacing w:after="120"/>
+      </w:pPr>
+      <w:r>
+        <w:t>La versión anterior de F4 y F1 fue aceptada en la sesión registrada. La revisión local del 17 de octubre mejora la presentación sin modificar política, modelos, plazos ni control de concurrencia. Se verificaron recorridos y adaptación de pantalla; quedan pendientes repetir usabilidad con personas, revisar accesibilidad con tecnologías de apoyo y renovar trazabilidad cuando se autorice versionar. La aceptación del rendimiento y sus límites técnicos se mantienen históricos.</w:t>
       </w:r>
     </w:p>
     <w:p>
+      <w:pPr>
+        <w:keepLines w:val="0"/>
+        <w:widowControl/>
+        <w:spacing w:after="120"/>
+      </w:pPr>
       <w:r>
         <w:rPr>
           <w:lang w:val="es-419"/>
@@ -5663,6 +5678,9 @@
     </w:p>
     <w:p>
       <w:pPr>
+        <w:keepLines w:val="0"/>
+        <w:widowControl/>
+        <w:spacing w:after="120"/>
         <w:rPr>
           <w:lang w:val="es-419"/>
         </w:rPr>
@@ -5672,6 +5690,327 @@
           <w:lang w:val="es-419"/>
         </w:rPr>
         <w:t>Al aprender a utilizar BMAD, ampliamos nuestra capacidad para conducir un proyecto asistido por IA. Pasamos de formular instrucciones y revisar respuestas a gestionar un desarrollo completo, evaluar propuestas técnicas, corregir interpretaciones y comprobar funcionalidades mediante pruebas. Este aprendizaje nos entrega una base más sólida para abordar proyectos de mayor complejidad, con mejor trazabilidad y mayor control sobre la implementación final.</w:t>
+      </w:r>
+    </w:p>
+    <w:p>
+      <w:pPr>
+        <w:keepLines w:val="0"/>
+        <w:widowControl/>
+        <w:spacing w:after="120"/>
+      </w:pPr>
+      <w:r>
+        <w:br w:type="page"/>
+      </w:r>
+    </w:p>
+    <w:p>
+      <w:pPr>
+        <w:pStyle w:val="Ttulo1"/>
+      </w:pPr>
+      <w:r>
+        <w:t>Anexos y referencias</w:t>
+      </w:r>
+    </w:p>
+    <w:p>
+      <w:pPr>
+        <w:pStyle w:val="Ttulo2"/>
+      </w:pPr>
+      <w:r>
+        <w:t>Anexo A Capturas de la interfaz revisada</w:t>
+      </w:r>
+    </w:p>
+    <w:p>
+      <w:pPr>
+        <w:keepLines w:val="0"/>
+        <w:widowControl/>
+        <w:spacing w:after="120"/>
+      </w:pPr>
+      <w:r>
+        <w:t>Capturas técnicas del 17 de octubre de 2026, tomadas con datos ficticios y base de pruebas aislada. Las vistas corresponden al estado local con mejoras locales respecto de la etiqueta v2.0. El visor PDF puede mostrar un enlace alternativo en el navegador de pruebas.</w:t>
+      </w:r>
+    </w:p>
+    <w:p>
+      <w:pPr>
+        <w:pStyle w:val="Descripcin"/>
+      </w:pPr>
+      <w:r>
+        <w:t>Figura 2 F4 Evaluación automática de casos</w:t>
+      </w:r>
+    </w:p>
+    <w:p>
+      <w:pPr>
+        <w:keepLines w:val="0"/>
+        <w:widowControl/>
+        <w:spacing w:after="120"/>
+      </w:pPr>
+      <w:r>
+        <w:drawing>
+          <wp:inline xmlns:a="http://schemas.openxmlformats.org/drawingml/2006/main" xmlns:pic="http://schemas.openxmlformats.org/drawingml/2006/picture">
+            <wp:extent cx="5897880" cy="3885865"/>
+            <wp:docPr id="2" name="Picture 2"/>
+            <wp:cNvGraphicFramePr>
+              <a:graphicFrameLocks noChangeAspect="1"/>
+            </wp:cNvGraphicFramePr>
+            <a:graphic>
+              <a:graphicData uri="http://schemas.openxmlformats.org/drawingml/2006/picture">
+                <pic:pic>
+                  <pic:nvPicPr>
+                    <pic:cNvPr id="0" name="f4-1366.png"/>
+                    <pic:cNvPicPr/>
+                  </pic:nvPicPr>
+                  <pic:blipFill>
+                    <a:blip r:embed="rId15"/>
+                    <a:stretch>
+                      <a:fillRect/>
+                    </a:stretch>
+                  </pic:blipFill>
+                  <pic:spPr>
+                    <a:xfrm>
+                      <a:off x="0" y="0"/>
+                      <a:ext cx="5897880" cy="3885865"/>
+                    </a:xfrm>
+                    <a:prstGeom prst="rect"/>
+                  </pic:spPr>
+                </pic:pic>
+              </a:graphicData>
+            </a:graphic>
+          </wp:inline>
+        </w:drawing>
+      </w:r>
+    </w:p>
+    <w:p>
+      <w:pPr>
+        <w:pStyle w:val="Descripcin"/>
+      </w:pPr>
+      <w:r>
+        <w:t>Figura 3 F1 Revisión humana asistida</w:t>
+      </w:r>
+    </w:p>
+    <w:p>
+      <w:pPr>
+        <w:keepLines w:val="0"/>
+        <w:widowControl/>
+        <w:spacing w:after="120"/>
+      </w:pPr>
+      <w:r>
+        <w:drawing>
+          <wp:inline xmlns:a="http://schemas.openxmlformats.org/drawingml/2006/main" xmlns:pic="http://schemas.openxmlformats.org/drawingml/2006/picture">
+            <wp:extent cx="5897880" cy="4015394"/>
+            <wp:docPr id="3" name="Picture 3"/>
+            <wp:cNvGraphicFramePr>
+              <a:graphicFrameLocks noChangeAspect="1"/>
+            </wp:cNvGraphicFramePr>
+            <a:graphic>
+              <a:graphicData uri="http://schemas.openxmlformats.org/drawingml/2006/picture">
+                <pic:pic>
+                  <pic:nvPicPr>
+                    <pic:cNvPr id="0" name="f1-1366.png"/>
+                    <pic:cNvPicPr/>
+                  </pic:nvPicPr>
+                  <pic:blipFill>
+                    <a:blip r:embed="rId16"/>
+                    <a:stretch>
+                      <a:fillRect/>
+                    </a:stretch>
+                  </pic:blipFill>
+                  <pic:spPr>
+                    <a:xfrm>
+                      <a:off x="0" y="0"/>
+                      <a:ext cx="5897880" cy="4015394"/>
+                    </a:xfrm>
+                    <a:prstGeom prst="rect"/>
+                  </pic:spPr>
+                </pic:pic>
+              </a:graphicData>
+            </a:graphic>
+          </wp:inline>
+        </w:drawing>
+      </w:r>
+    </w:p>
+    <w:p>
+      <w:pPr>
+        <w:pStyle w:val="Descripcin"/>
+      </w:pPr>
+      <w:r>
+        <w:t>Figura 4 Detalle de revisión humana y evidencia</w:t>
+      </w:r>
+    </w:p>
+    <w:p>
+      <w:pPr>
+        <w:keepLines w:val="0"/>
+        <w:widowControl/>
+        <w:spacing w:after="120"/>
+      </w:pPr>
+      <w:r>
+        <w:drawing>
+          <wp:inline xmlns:a="http://schemas.openxmlformats.org/drawingml/2006/main" xmlns:pic="http://schemas.openxmlformats.org/drawingml/2006/picture">
+            <wp:extent cx="5897880" cy="5181154"/>
+            <wp:docPr id="4" name="Picture 4"/>
+            <wp:cNvGraphicFramePr>
+              <a:graphicFrameLocks noChangeAspect="1"/>
+            </wp:cNvGraphicFramePr>
+            <a:graphic>
+              <a:graphicData uri="http://schemas.openxmlformats.org/drawingml/2006/picture">
+                <pic:pic>
+                  <pic:nvPicPr>
+                    <pic:cNvPr id="0" name="detalle-1366.png"/>
+                    <pic:cNvPicPr/>
+                  </pic:nvPicPr>
+                  <pic:blipFill>
+                    <a:blip r:embed="rId17"/>
+                    <a:stretch>
+                      <a:fillRect/>
+                    </a:stretch>
+                  </pic:blipFill>
+                  <pic:spPr>
+                    <a:xfrm>
+                      <a:off x="0" y="0"/>
+                      <a:ext cx="5897880" cy="5181154"/>
+                    </a:xfrm>
+                    <a:prstGeom prst="rect"/>
+                  </pic:spPr>
+                </pic:pic>
+              </a:graphicData>
+            </a:graphic>
+          </wp:inline>
+        </w:drawing>
+      </w:r>
+    </w:p>
+    <w:p>
+      <w:pPr>
+        <w:pStyle w:val="Ttulo2"/>
+      </w:pPr>
+      <w:r>
+        <w:t>Anexo B Evidencia y referencias del repositorio</w:t>
+      </w:r>
+    </w:p>
+    <w:p>
+      <w:pPr>
+        <w:keepLines w:val="0"/>
+        <w:widowControl/>
+        <w:spacing w:after="120"/>
+      </w:pPr>
+      <w:r>
+        <w:t>R1. LLM - MIRA_E2_Baseline_F4_F1.md: decisiones, requisitos y hallazgos de origen.</w:t>
+      </w:r>
+    </w:p>
+    <w:p>
+      <w:pPr>
+        <w:keepLines w:val="0"/>
+        <w:widowControl/>
+        <w:spacing w:after="120"/>
+      </w:pPr>
+      <w:r>
+        <w:t>R2. docs/trazabilidad-must.md y docs/qa/traceability.json: matriz histórica de Must y requisitos derivados.</w:t>
+      </w:r>
+    </w:p>
+    <w:p>
+      <w:pPr>
+        <w:keepLines w:val="0"/>
+        <w:widowControl/>
+        <w:spacing w:after="120"/>
+      </w:pPr>
+      <w:r>
+        <w:t>R3. docs/qa/measurements.json: configuración y muestras históricas de rendimiento.</w:t>
+      </w:r>
+    </w:p>
+    <w:p>
+      <w:pPr>
+        <w:keepLines w:val="0"/>
+        <w:widowControl/>
+        <w:spacing w:after="120"/>
+      </w:pPr>
+      <w:r>
+        <w:t>R4. docs/qa/usabilidad-px05.md: actas originales; no constituyen prueba del rediseño.</w:t>
+      </w:r>
+    </w:p>
+    <w:p>
+      <w:pPr>
+        <w:keepLines w:val="0"/>
+        <w:widowControl/>
+        <w:spacing w:after="120"/>
+      </w:pPr>
+      <w:r>
+        <w:t>R5. docs/qa/aceptacion-sebastian.md: aceptación original de F4/F1 del 4 de octubre de 2026.</w:t>
+      </w:r>
+    </w:p>
+    <w:p>
+      <w:pPr>
+        <w:keepLines w:val="0"/>
+        <w:widowControl/>
+        <w:spacing w:after="120"/>
+      </w:pPr>
+      <w:r>
+        <w:t>R6. docs/qa/aceptacion-rendimiento.md: aceptación de la desviación de CPU.</w:t>
+      </w:r>
+    </w:p>
+    <w:p>
+      <w:pPr>
+        <w:keepLines w:val="0"/>
+        <w:widowControl/>
+        <w:spacing w:after="120"/>
+      </w:pPr>
+      <w:r>
+        <w:t>R7. README.md y docs/qa/instalacion-readme.md: instalación y reproducción.</w:t>
+      </w:r>
+    </w:p>
+    <w:p>
+      <w:pPr>
+        <w:keepLines w:val="0"/>
+        <w:widowControl/>
+        <w:spacing w:after="120"/>
+      </w:pPr>
+      <w:r>
+        <w:t>R8. LLM - MIRA_Entrega2_bitacora_decisiones.md: secuencia de decisiones y actualizaciones.</w:t>
+      </w:r>
+    </w:p>
+    <w:p>
+      <w:pPr>
+        <w:keepLines w:val="0"/>
+        <w:widowControl/>
+        <w:spacing w:after="120"/>
+      </w:pPr>
+      <w:r>
+        <w:t>R9. _bmad/config.toml y _bmad-output/: artefactos del método.</w:t>
+      </w:r>
+    </w:p>
+    <w:p>
+      <w:pPr>
+        <w:keepLines w:val="0"/>
+        <w:widowControl/>
+        <w:spacing w:after="120"/>
+      </w:pPr>
+      <w:r>
+        <w:t>R10. docs/qa/review-bmad.md, tests/ y src/mira/web/tests.py: revisión y pruebas.</w:t>
+      </w:r>
+    </w:p>
+    <w:p>
+      <w:pPr>
+        <w:keepLines w:val="0"/>
+        <w:widowControl/>
+        <w:spacing w:after="120"/>
+      </w:pPr>
+      <w:r>
+        <w:t>R11. Contexto-fase1-bmad/LLM - Entrega_2_MIRA_SDD_BMAD.pdf: enunciado E2.</w:t>
+      </w:r>
+    </w:p>
+    <w:p>
+      <w:pPr>
+        <w:keepLines w:val="0"/>
+        <w:widowControl/>
+        <w:spacing w:after="120"/>
+      </w:pPr>
+      <w:r>
+        <w:t>R12. prompts_completos.md y docs/qa/commit-author-map.json: asistencia y procedencia.</w:t>
+      </w:r>
+    </w:p>
+    <w:p>
+      <w:pPr>
+        <w:keepLines w:val="0"/>
+        <w:widowControl/>
+        <w:spacing w:after="120"/>
+      </w:pPr>
+      <w:r>
+        <w:t>R13. docs/qa/frontend-2026-10-17/QA.md y contrast.json; tests/test_frontend_ux.py; _bmad-output/planning-artifacts/ux-designs/ux-mira-mejora-frontend-2026-10-17/; _bmad-output/implementation-artifacts/frontend-mira-2026-10-17/: propuesta aprobada, contratos, arquitectura, cinco historias y evidencia de revisión local.</w:t>
       </w:r>
     </w:p>
     <w:sectPr>
@@ -6424,6 +6763,7 @@
       <w:rFonts w:asciiTheme="majorHAnsi" w:eastAsiaTheme="majorEastAsia" w:hAnsiTheme="majorHAnsi" w:cstheme="majorBidi"/>
       <w:b/>
       <w:bCs/>
+      <w:color w:val="000000"/>
       <w:sz w:val="34"/>
       <w:szCs w:val="28"/>
     </w:rPr>
@@ -6447,6 +6787,7 @@
       <w:rFonts w:asciiTheme="majorHAnsi" w:eastAsiaTheme="majorEastAsia" w:hAnsiTheme="majorHAnsi" w:cstheme="majorBidi"/>
       <w:b/>
       <w:bCs/>
+      <w:color w:val="000000"/>
       <w:sz w:val="23"/>
       <w:szCs w:val="26"/>
     </w:rPr>
@@ -6470,7 +6811,7 @@
       <w:rFonts w:asciiTheme="majorHAnsi" w:eastAsiaTheme="majorEastAsia" w:hAnsiTheme="majorHAnsi" w:cstheme="majorBidi"/>
       <w:b/>
       <w:bCs/>
-      <w:color w:val="4F81BD" w:themeColor="accent1"/>
+      <w:color w:val="000000"/>
     </w:rPr>
   </w:style>
   <w:style w:type="paragraph" w:styleId="Ttulo4">
@@ -6752,6 +7093,7 @@
     </w:pPr>
     <w:rPr>
       <w:rFonts w:asciiTheme="majorHAnsi" w:eastAsiaTheme="majorEastAsia" w:hAnsiTheme="majorHAnsi" w:cstheme="majorBidi"/>
+      <w:color w:val="000000"/>
       <w:spacing w:val="5"/>
       <w:kern w:val="28"/>
       <w:sz w:val="64"/>
@@ -7180,6 +7522,7 @@
     <w:qFormat/>
     <w:rsid w:val="00FC693F"/>
     <w:pPr>
+      <w:keepNext/>
       <w:spacing w:line="220" w:lineRule="exact"/>
     </w:pPr>
     <w:rPr>

</xml_diff>